<commit_message>
Assemble V5 manuscript in UM submission template
</commit_message>
<xml_diff>
--- a/docs/P2_V5_INTEGRATED_MANUSCRIPT.docx
+++ b/docs/P2_V5_INTEGRATED_MANUSCRIPT.docx
@@ -122,12 +122,8 @@
         </w:tabs>
         <w:ind w:left="440"/>
         <w:rPr>
-          <w:rFonts w:asciiTheme="minorHAnsi" w:hAnsiTheme="minorHAnsi" w:hint="eastAsia"/>
+          <w:rFonts w:hint="eastAsia"/>
           <w:noProof/>
-          <w:kern w:val="2"/>
-          <w:szCs w:val="24"/>
-          <w:lang w:eastAsia="zh-CN"/>
-          <w14:ligatures w14:val="standardContextual"/>
         </w:rPr>
       </w:pPr>
       <w:r>
@@ -139,7 +135,7 @@
       <w:r>
         <w:fldChar w:fldCharType="separate"/>
       </w:r>
-      <w:hyperlink w:anchor="_Toc238056239" w:history="1">
+      <w:hyperlink w:anchor="_Toc238056898" w:history="1">
         <w:r>
           <w:rPr>
             <w:rStyle w:val="aff9"/>
@@ -176,7 +172,7 @@
             <w:noProof/>
             <w:webHidden/>
           </w:rPr>
-          <w:instrText>PAGEREF _Toc238056239 \h</w:instrText>
+          <w:instrText>PAGEREF _Toc238056898 \h</w:instrText>
         </w:r>
         <w:r>
           <w:rPr>
@@ -225,15 +221,11 @@
           <w:tab w:val="right" w:leader="dot" w:pos="9350"/>
         </w:tabs>
         <w:rPr>
-          <w:rFonts w:asciiTheme="minorHAnsi" w:hAnsiTheme="minorHAnsi" w:hint="eastAsia"/>
+          <w:rFonts w:hint="eastAsia"/>
           <w:noProof/>
-          <w:kern w:val="2"/>
-          <w:szCs w:val="24"/>
-          <w:lang w:eastAsia="zh-CN"/>
-          <w14:ligatures w14:val="standardContextual"/>
         </w:rPr>
       </w:pPr>
-      <w:hyperlink w:anchor="_Toc238056240" w:history="1">
+      <w:hyperlink w:anchor="_Toc238056899" w:history="1">
         <w:r>
           <w:rPr>
             <w:rStyle w:val="aff9"/>
@@ -270,7 +262,7 @@
             <w:noProof/>
             <w:webHidden/>
           </w:rPr>
-          <w:instrText>PAGEREF _Toc238056240 \h</w:instrText>
+          <w:instrText>PAGEREF _Toc238056899 \h</w:instrText>
         </w:r>
         <w:r>
           <w:rPr>
@@ -320,15 +312,11 @@
         </w:tabs>
         <w:ind w:left="440"/>
         <w:rPr>
-          <w:rFonts w:asciiTheme="minorHAnsi" w:hAnsiTheme="minorHAnsi" w:hint="eastAsia"/>
+          <w:rFonts w:hint="eastAsia"/>
           <w:noProof/>
-          <w:kern w:val="2"/>
-          <w:szCs w:val="24"/>
-          <w:lang w:eastAsia="zh-CN"/>
-          <w14:ligatures w14:val="standardContextual"/>
         </w:rPr>
       </w:pPr>
-      <w:hyperlink w:anchor="_Toc238056241" w:history="1">
+      <w:hyperlink w:anchor="_Toc238056900" w:history="1">
         <w:r>
           <w:rPr>
             <w:rStyle w:val="aff9"/>
@@ -365,7 +353,7 @@
             <w:noProof/>
             <w:webHidden/>
           </w:rPr>
-          <w:instrText>PAGEREF _Toc238056241 \h</w:instrText>
+          <w:instrText>PAGEREF _Toc238056900 \h</w:instrText>
         </w:r>
         <w:r>
           <w:rPr>
@@ -415,15 +403,11 @@
         </w:tabs>
         <w:ind w:left="440"/>
         <w:rPr>
-          <w:rFonts w:asciiTheme="minorHAnsi" w:hAnsiTheme="minorHAnsi" w:hint="eastAsia"/>
+          <w:rFonts w:hint="eastAsia"/>
           <w:noProof/>
-          <w:kern w:val="2"/>
-          <w:szCs w:val="24"/>
-          <w:lang w:eastAsia="zh-CN"/>
-          <w14:ligatures w14:val="standardContextual"/>
         </w:rPr>
       </w:pPr>
-      <w:hyperlink w:anchor="_Toc238056242" w:history="1">
+      <w:hyperlink w:anchor="_Toc238056901" w:history="1">
         <w:r>
           <w:rPr>
             <w:rStyle w:val="aff9"/>
@@ -460,7 +444,7 @@
             <w:noProof/>
             <w:webHidden/>
           </w:rPr>
-          <w:instrText>PAGEREF _Toc238056242 \h</w:instrText>
+          <w:instrText>PAGEREF _Toc238056901 \h</w:instrText>
         </w:r>
         <w:r>
           <w:rPr>
@@ -510,15 +494,11 @@
         </w:tabs>
         <w:ind w:left="440"/>
         <w:rPr>
-          <w:rFonts w:asciiTheme="minorHAnsi" w:hAnsiTheme="minorHAnsi" w:hint="eastAsia"/>
+          <w:rFonts w:hint="eastAsia"/>
           <w:noProof/>
-          <w:kern w:val="2"/>
-          <w:szCs w:val="24"/>
-          <w:lang w:eastAsia="zh-CN"/>
-          <w14:ligatures w14:val="standardContextual"/>
         </w:rPr>
       </w:pPr>
-      <w:hyperlink w:anchor="_Toc238056243" w:history="1">
+      <w:hyperlink w:anchor="_Toc238056902" w:history="1">
         <w:r>
           <w:rPr>
             <w:rStyle w:val="aff9"/>
@@ -555,7 +535,7 @@
             <w:noProof/>
             <w:webHidden/>
           </w:rPr>
-          <w:instrText>PAGEREF _Toc238056243 \h</w:instrText>
+          <w:instrText>PAGEREF _Toc238056902 \h</w:instrText>
         </w:r>
         <w:r>
           <w:rPr>
@@ -605,15 +585,11 @@
         </w:tabs>
         <w:ind w:left="440"/>
         <w:rPr>
-          <w:rFonts w:asciiTheme="minorHAnsi" w:hAnsiTheme="minorHAnsi" w:hint="eastAsia"/>
+          <w:rFonts w:hint="eastAsia"/>
           <w:noProof/>
-          <w:kern w:val="2"/>
-          <w:szCs w:val="24"/>
-          <w:lang w:eastAsia="zh-CN"/>
-          <w14:ligatures w14:val="standardContextual"/>
         </w:rPr>
       </w:pPr>
-      <w:hyperlink w:anchor="_Toc238056244" w:history="1">
+      <w:hyperlink w:anchor="_Toc238056903" w:history="1">
         <w:r>
           <w:rPr>
             <w:rStyle w:val="aff9"/>
@@ -650,7 +626,7 @@
             <w:noProof/>
             <w:webHidden/>
           </w:rPr>
-          <w:instrText>PAGEREF _Toc238056244 \h</w:instrText>
+          <w:instrText>PAGEREF _Toc238056903 \h</w:instrText>
         </w:r>
         <w:r>
           <w:rPr>
@@ -700,15 +676,11 @@
         </w:tabs>
         <w:ind w:left="440"/>
         <w:rPr>
-          <w:rFonts w:asciiTheme="minorHAnsi" w:hAnsiTheme="minorHAnsi" w:hint="eastAsia"/>
+          <w:rFonts w:hint="eastAsia"/>
           <w:noProof/>
-          <w:kern w:val="2"/>
-          <w:szCs w:val="24"/>
-          <w:lang w:eastAsia="zh-CN"/>
-          <w14:ligatures w14:val="standardContextual"/>
         </w:rPr>
       </w:pPr>
-      <w:hyperlink w:anchor="_Toc238056245" w:history="1">
+      <w:hyperlink w:anchor="_Toc238056904" w:history="1">
         <w:r>
           <w:rPr>
             <w:rStyle w:val="aff9"/>
@@ -745,7 +717,7 @@
             <w:noProof/>
             <w:webHidden/>
           </w:rPr>
-          <w:instrText>PAGEREF _Toc238056245 \h</w:instrText>
+          <w:instrText>PAGEREF _Toc238056904 \h</w:instrText>
         </w:r>
         <w:r>
           <w:rPr>
@@ -795,15 +767,11 @@
         </w:tabs>
         <w:ind w:left="440"/>
         <w:rPr>
-          <w:rFonts w:asciiTheme="minorHAnsi" w:hAnsiTheme="minorHAnsi" w:hint="eastAsia"/>
+          <w:rFonts w:hint="eastAsia"/>
           <w:noProof/>
-          <w:kern w:val="2"/>
-          <w:szCs w:val="24"/>
-          <w:lang w:eastAsia="zh-CN"/>
-          <w14:ligatures w14:val="standardContextual"/>
         </w:rPr>
       </w:pPr>
-      <w:hyperlink w:anchor="_Toc238056246" w:history="1">
+      <w:hyperlink w:anchor="_Toc238056905" w:history="1">
         <w:r>
           <w:rPr>
             <w:rStyle w:val="aff9"/>
@@ -840,7 +808,7 @@
             <w:noProof/>
             <w:webHidden/>
           </w:rPr>
-          <w:instrText>PAGEREF _Toc238056246 \h</w:instrText>
+          <w:instrText>PAGEREF _Toc238056905 \h</w:instrText>
         </w:r>
         <w:r>
           <w:rPr>
@@ -890,15 +858,11 @@
         </w:tabs>
         <w:ind w:left="440"/>
         <w:rPr>
-          <w:rFonts w:asciiTheme="minorHAnsi" w:hAnsiTheme="minorHAnsi" w:hint="eastAsia"/>
+          <w:rFonts w:hint="eastAsia"/>
           <w:noProof/>
-          <w:kern w:val="2"/>
-          <w:szCs w:val="24"/>
-          <w:lang w:eastAsia="zh-CN"/>
-          <w14:ligatures w14:val="standardContextual"/>
         </w:rPr>
       </w:pPr>
-      <w:hyperlink w:anchor="_Toc238056247" w:history="1">
+      <w:hyperlink w:anchor="_Toc238056906" w:history="1">
         <w:r>
           <w:rPr>
             <w:rStyle w:val="aff9"/>
@@ -935,7 +899,7 @@
             <w:noProof/>
             <w:webHidden/>
           </w:rPr>
-          <w:instrText>PAGEREF _Toc238056247 \h</w:instrText>
+          <w:instrText>PAGEREF _Toc238056906 \h</w:instrText>
         </w:r>
         <w:r>
           <w:rPr>
@@ -985,15 +949,11 @@
         </w:tabs>
         <w:ind w:left="440"/>
         <w:rPr>
-          <w:rFonts w:asciiTheme="minorHAnsi" w:hAnsiTheme="minorHAnsi" w:hint="eastAsia"/>
+          <w:rFonts w:hint="eastAsia"/>
           <w:noProof/>
-          <w:kern w:val="2"/>
-          <w:szCs w:val="24"/>
-          <w:lang w:eastAsia="zh-CN"/>
-          <w14:ligatures w14:val="standardContextual"/>
         </w:rPr>
       </w:pPr>
-      <w:hyperlink w:anchor="_Toc238056248" w:history="1">
+      <w:hyperlink w:anchor="_Toc238056907" w:history="1">
         <w:r>
           <w:rPr>
             <w:rStyle w:val="aff9"/>
@@ -1030,7 +990,7 @@
             <w:noProof/>
             <w:webHidden/>
           </w:rPr>
-          <w:instrText>PAGEREF _Toc238056248 \h</w:instrText>
+          <w:instrText>PAGEREF _Toc238056907 \h</w:instrText>
         </w:r>
         <w:r>
           <w:rPr>
@@ -1079,15 +1039,11 @@
           <w:tab w:val="right" w:leader="dot" w:pos="9350"/>
         </w:tabs>
         <w:rPr>
-          <w:rFonts w:asciiTheme="minorHAnsi" w:hAnsiTheme="minorHAnsi" w:hint="eastAsia"/>
+          <w:rFonts w:hint="eastAsia"/>
           <w:noProof/>
-          <w:kern w:val="2"/>
-          <w:szCs w:val="24"/>
-          <w:lang w:eastAsia="zh-CN"/>
-          <w14:ligatures w14:val="standardContextual"/>
         </w:rPr>
       </w:pPr>
-      <w:hyperlink w:anchor="_Toc238056249" w:history="1">
+      <w:hyperlink w:anchor="_Toc238056908" w:history="1">
         <w:r>
           <w:rPr>
             <w:rStyle w:val="aff9"/>
@@ -1124,7 +1080,7 @@
             <w:noProof/>
             <w:webHidden/>
           </w:rPr>
-          <w:instrText>PAGEREF _Toc238056249 \h</w:instrText>
+          <w:instrText>PAGEREF _Toc238056908 \h</w:instrText>
         </w:r>
         <w:r>
           <w:rPr>
@@ -1174,15 +1130,11 @@
         </w:tabs>
         <w:ind w:left="440"/>
         <w:rPr>
-          <w:rFonts w:asciiTheme="minorHAnsi" w:hAnsiTheme="minorHAnsi" w:hint="eastAsia"/>
+          <w:rFonts w:hint="eastAsia"/>
           <w:noProof/>
-          <w:kern w:val="2"/>
-          <w:szCs w:val="24"/>
-          <w:lang w:eastAsia="zh-CN"/>
-          <w14:ligatures w14:val="standardContextual"/>
         </w:rPr>
       </w:pPr>
-      <w:hyperlink w:anchor="_Toc238056250" w:history="1">
+      <w:hyperlink w:anchor="_Toc238056909" w:history="1">
         <w:r>
           <w:rPr>
             <w:rStyle w:val="aff9"/>
@@ -1219,7 +1171,7 @@
             <w:noProof/>
             <w:webHidden/>
           </w:rPr>
-          <w:instrText>PAGEREF _Toc238056250 \h</w:instrText>
+          <w:instrText>PAGEREF _Toc238056909 \h</w:instrText>
         </w:r>
         <w:r>
           <w:rPr>
@@ -1269,15 +1221,11 @@
         </w:tabs>
         <w:ind w:left="440"/>
         <w:rPr>
-          <w:rFonts w:asciiTheme="minorHAnsi" w:hAnsiTheme="minorHAnsi" w:hint="eastAsia"/>
+          <w:rFonts w:hint="eastAsia"/>
           <w:noProof/>
-          <w:kern w:val="2"/>
-          <w:szCs w:val="24"/>
-          <w:lang w:eastAsia="zh-CN"/>
-          <w14:ligatures w14:val="standardContextual"/>
         </w:rPr>
       </w:pPr>
-      <w:hyperlink w:anchor="_Toc238056251" w:history="1">
+      <w:hyperlink w:anchor="_Toc238056910" w:history="1">
         <w:r>
           <w:rPr>
             <w:rStyle w:val="aff9"/>
@@ -1314,7 +1262,7 @@
             <w:noProof/>
             <w:webHidden/>
           </w:rPr>
-          <w:instrText>PAGEREF _Toc238056251 \h</w:instrText>
+          <w:instrText>PAGEREF _Toc238056910 \h</w:instrText>
         </w:r>
         <w:r>
           <w:rPr>
@@ -1364,15 +1312,11 @@
         </w:tabs>
         <w:ind w:left="440"/>
         <w:rPr>
-          <w:rFonts w:asciiTheme="minorHAnsi" w:hAnsiTheme="minorHAnsi" w:hint="eastAsia"/>
+          <w:rFonts w:hint="eastAsia"/>
           <w:noProof/>
-          <w:kern w:val="2"/>
-          <w:szCs w:val="24"/>
-          <w:lang w:eastAsia="zh-CN"/>
-          <w14:ligatures w14:val="standardContextual"/>
         </w:rPr>
       </w:pPr>
-      <w:hyperlink w:anchor="_Toc238056252" w:history="1">
+      <w:hyperlink w:anchor="_Toc238056911" w:history="1">
         <w:r>
           <w:rPr>
             <w:rStyle w:val="aff9"/>
@@ -1409,7 +1353,7 @@
             <w:noProof/>
             <w:webHidden/>
           </w:rPr>
-          <w:instrText>PAGEREF _Toc238056252 \h</w:instrText>
+          <w:instrText>PAGEREF _Toc238056911 \h</w:instrText>
         </w:r>
         <w:r>
           <w:rPr>
@@ -1459,15 +1403,11 @@
         </w:tabs>
         <w:ind w:left="440"/>
         <w:rPr>
-          <w:rFonts w:asciiTheme="minorHAnsi" w:hAnsiTheme="minorHAnsi" w:hint="eastAsia"/>
+          <w:rFonts w:hint="eastAsia"/>
           <w:noProof/>
-          <w:kern w:val="2"/>
-          <w:szCs w:val="24"/>
-          <w:lang w:eastAsia="zh-CN"/>
-          <w14:ligatures w14:val="standardContextual"/>
         </w:rPr>
       </w:pPr>
-      <w:hyperlink w:anchor="_Toc238056253" w:history="1">
+      <w:hyperlink w:anchor="_Toc238056912" w:history="1">
         <w:r>
           <w:rPr>
             <w:rStyle w:val="aff9"/>
@@ -1504,7 +1444,7 @@
             <w:noProof/>
             <w:webHidden/>
           </w:rPr>
-          <w:instrText>PAGEREF _Toc238056253 \h</w:instrText>
+          <w:instrText>PAGEREF _Toc238056912 \h</w:instrText>
         </w:r>
         <w:r>
           <w:rPr>
@@ -1554,15 +1494,11 @@
         </w:tabs>
         <w:ind w:left="440"/>
         <w:rPr>
-          <w:rFonts w:asciiTheme="minorHAnsi" w:hAnsiTheme="minorHAnsi" w:hint="eastAsia"/>
+          <w:rFonts w:hint="eastAsia"/>
           <w:noProof/>
-          <w:kern w:val="2"/>
-          <w:szCs w:val="24"/>
-          <w:lang w:eastAsia="zh-CN"/>
-          <w14:ligatures w14:val="standardContextual"/>
         </w:rPr>
       </w:pPr>
-      <w:hyperlink w:anchor="_Toc238056254" w:history="1">
+      <w:hyperlink w:anchor="_Toc238056913" w:history="1">
         <w:r>
           <w:rPr>
             <w:rStyle w:val="aff9"/>
@@ -1599,7 +1535,7 @@
             <w:noProof/>
             <w:webHidden/>
           </w:rPr>
-          <w:instrText>PAGEREF _Toc238056254 \h</w:instrText>
+          <w:instrText>PAGEREF _Toc238056913 \h</w:instrText>
         </w:r>
         <w:r>
           <w:rPr>
@@ -1649,15 +1585,11 @@
         </w:tabs>
         <w:ind w:left="440"/>
         <w:rPr>
-          <w:rFonts w:asciiTheme="minorHAnsi" w:hAnsiTheme="minorHAnsi" w:hint="eastAsia"/>
+          <w:rFonts w:hint="eastAsia"/>
           <w:noProof/>
-          <w:kern w:val="2"/>
-          <w:szCs w:val="24"/>
-          <w:lang w:eastAsia="zh-CN"/>
-          <w14:ligatures w14:val="standardContextual"/>
         </w:rPr>
       </w:pPr>
-      <w:hyperlink w:anchor="_Toc238056255" w:history="1">
+      <w:hyperlink w:anchor="_Toc238056914" w:history="1">
         <w:r>
           <w:rPr>
             <w:rStyle w:val="aff9"/>
@@ -1694,7 +1626,7 @@
             <w:noProof/>
             <w:webHidden/>
           </w:rPr>
-          <w:instrText>PAGEREF _Toc238056255 \h</w:instrText>
+          <w:instrText>PAGEREF _Toc238056914 \h</w:instrText>
         </w:r>
         <w:r>
           <w:rPr>
@@ -1744,15 +1676,11 @@
         </w:tabs>
         <w:ind w:left="440"/>
         <w:rPr>
-          <w:rFonts w:asciiTheme="minorHAnsi" w:hAnsiTheme="minorHAnsi" w:hint="eastAsia"/>
+          <w:rFonts w:hint="eastAsia"/>
           <w:noProof/>
-          <w:kern w:val="2"/>
-          <w:szCs w:val="24"/>
-          <w:lang w:eastAsia="zh-CN"/>
-          <w14:ligatures w14:val="standardContextual"/>
         </w:rPr>
       </w:pPr>
-      <w:hyperlink w:anchor="_Toc238056256" w:history="1">
+      <w:hyperlink w:anchor="_Toc238056915" w:history="1">
         <w:r>
           <w:rPr>
             <w:rStyle w:val="aff9"/>
@@ -1789,7 +1717,7 @@
             <w:noProof/>
             <w:webHidden/>
           </w:rPr>
-          <w:instrText>PAGEREF _Toc238056256 \h</w:instrText>
+          <w:instrText>PAGEREF _Toc238056915 \h</w:instrText>
         </w:r>
         <w:r>
           <w:rPr>
@@ -1839,15 +1767,11 @@
         </w:tabs>
         <w:ind w:left="440"/>
         <w:rPr>
-          <w:rFonts w:asciiTheme="minorHAnsi" w:hAnsiTheme="minorHAnsi" w:hint="eastAsia"/>
+          <w:rFonts w:hint="eastAsia"/>
           <w:noProof/>
-          <w:kern w:val="2"/>
-          <w:szCs w:val="24"/>
-          <w:lang w:eastAsia="zh-CN"/>
-          <w14:ligatures w14:val="standardContextual"/>
         </w:rPr>
       </w:pPr>
-      <w:hyperlink w:anchor="_Toc238056257" w:history="1">
+      <w:hyperlink w:anchor="_Toc238056916" w:history="1">
         <w:r>
           <w:rPr>
             <w:rStyle w:val="aff9"/>
@@ -1884,7 +1808,7 @@
             <w:noProof/>
             <w:webHidden/>
           </w:rPr>
-          <w:instrText>PAGEREF _Toc238056257 \h</w:instrText>
+          <w:instrText>PAGEREF _Toc238056916 \h</w:instrText>
         </w:r>
         <w:r>
           <w:rPr>
@@ -1934,15 +1858,11 @@
         </w:tabs>
         <w:ind w:left="440"/>
         <w:rPr>
-          <w:rFonts w:asciiTheme="minorHAnsi" w:hAnsiTheme="minorHAnsi" w:hint="eastAsia"/>
+          <w:rFonts w:hint="eastAsia"/>
           <w:noProof/>
-          <w:kern w:val="2"/>
-          <w:szCs w:val="24"/>
-          <w:lang w:eastAsia="zh-CN"/>
-          <w14:ligatures w14:val="standardContextual"/>
         </w:rPr>
       </w:pPr>
-      <w:hyperlink w:anchor="_Toc238056258" w:history="1">
+      <w:hyperlink w:anchor="_Toc238056917" w:history="1">
         <w:r>
           <w:rPr>
             <w:rStyle w:val="aff9"/>
@@ -1979,7 +1899,7 @@
             <w:noProof/>
             <w:webHidden/>
           </w:rPr>
-          <w:instrText>PAGEREF _Toc238056258 \h</w:instrText>
+          <w:instrText>PAGEREF _Toc238056917 \h</w:instrText>
         </w:r>
         <w:r>
           <w:rPr>
@@ -2029,15 +1949,11 @@
         </w:tabs>
         <w:ind w:left="440"/>
         <w:rPr>
-          <w:rFonts w:asciiTheme="minorHAnsi" w:hAnsiTheme="minorHAnsi" w:hint="eastAsia"/>
+          <w:rFonts w:hint="eastAsia"/>
           <w:noProof/>
-          <w:kern w:val="2"/>
-          <w:szCs w:val="24"/>
-          <w:lang w:eastAsia="zh-CN"/>
-          <w14:ligatures w14:val="standardContextual"/>
         </w:rPr>
       </w:pPr>
-      <w:hyperlink w:anchor="_Toc238056259" w:history="1">
+      <w:hyperlink w:anchor="_Toc238056918" w:history="1">
         <w:r>
           <w:rPr>
             <w:rStyle w:val="aff9"/>
@@ -2074,7 +1990,7 @@
             <w:noProof/>
             <w:webHidden/>
           </w:rPr>
-          <w:instrText>PAGEREF _Toc238056259 \h</w:instrText>
+          <w:instrText>PAGEREF _Toc238056918 \h</w:instrText>
         </w:r>
         <w:r>
           <w:rPr>
@@ -2123,15 +2039,11 @@
           <w:tab w:val="right" w:leader="dot" w:pos="9350"/>
         </w:tabs>
         <w:rPr>
-          <w:rFonts w:asciiTheme="minorHAnsi" w:hAnsiTheme="minorHAnsi" w:hint="eastAsia"/>
+          <w:rFonts w:hint="eastAsia"/>
           <w:noProof/>
-          <w:kern w:val="2"/>
-          <w:szCs w:val="24"/>
-          <w:lang w:eastAsia="zh-CN"/>
-          <w14:ligatures w14:val="standardContextual"/>
         </w:rPr>
       </w:pPr>
-      <w:hyperlink w:anchor="_Toc238056260" w:history="1">
+      <w:hyperlink w:anchor="_Toc238056919" w:history="1">
         <w:r>
           <w:rPr>
             <w:rStyle w:val="aff9"/>
@@ -2168,7 +2080,7 @@
             <w:noProof/>
             <w:webHidden/>
           </w:rPr>
-          <w:instrText>PAGEREF _Toc238056260 \h</w:instrText>
+          <w:instrText>PAGEREF _Toc238056919 \h</w:instrText>
         </w:r>
         <w:r>
           <w:rPr>
@@ -2218,29 +2130,17 @@
         </w:tabs>
         <w:ind w:left="440"/>
         <w:rPr>
-          <w:rFonts w:asciiTheme="minorHAnsi" w:hAnsiTheme="minorHAnsi" w:hint="eastAsia"/>
+          <w:rFonts w:hint="eastAsia"/>
           <w:noProof/>
-          <w:kern w:val="2"/>
-          <w:szCs w:val="24"/>
-          <w:lang w:eastAsia="zh-CN"/>
-          <w14:ligatures w14:val="standardContextual"/>
         </w:rPr>
       </w:pPr>
-      <w:hyperlink w:anchor="_Toc238056261" w:history="1">
+      <w:hyperlink w:anchor="_Toc238056920" w:history="1">
         <w:r>
           <w:rPr>
             <w:rStyle w:val="aff9"/>
             <w:noProof/>
           </w:rPr>
-          <w:t>3.1 R</w:t>
-        </w:r>
-        <w:r>
-          <w:rPr>
-            <w:rStyle w:val="aff9"/>
-            <w:noProof/>
-          </w:rPr>
-          <w:lastRenderedPageBreak/>
-          <w:t>esearch Design</w:t>
+          <w:t>3.1 Research Design</w:t>
         </w:r>
         <w:r>
           <w:rPr>
@@ -2271,7 +2171,7 @@
             <w:noProof/>
             <w:webHidden/>
           </w:rPr>
-          <w:instrText>PAGEREF _Toc238056261 \h</w:instrText>
+          <w:instrText>PAGEREF _Toc238056920 \h</w:instrText>
         </w:r>
         <w:r>
           <w:rPr>
@@ -2321,15 +2221,11 @@
         </w:tabs>
         <w:ind w:left="440"/>
         <w:rPr>
-          <w:rFonts w:asciiTheme="minorHAnsi" w:hAnsiTheme="minorHAnsi" w:hint="eastAsia"/>
+          <w:rFonts w:hint="eastAsia"/>
           <w:noProof/>
-          <w:kern w:val="2"/>
-          <w:szCs w:val="24"/>
-          <w:lang w:eastAsia="zh-CN"/>
-          <w14:ligatures w14:val="standardContextual"/>
         </w:rPr>
       </w:pPr>
-      <w:hyperlink w:anchor="_Toc238056262" w:history="1">
+      <w:hyperlink w:anchor="_Toc238056921" w:history="1">
         <w:r>
           <w:rPr>
             <w:rStyle w:val="aff9"/>
@@ -2366,7 +2262,7 @@
             <w:noProof/>
             <w:webHidden/>
           </w:rPr>
-          <w:instrText>PAGEREF _Toc238056262 \h</w:instrText>
+          <w:instrText>PAGEREF _Toc238056921 \h</w:instrText>
         </w:r>
         <w:r>
           <w:rPr>
@@ -2416,15 +2312,11 @@
         </w:tabs>
         <w:ind w:left="440"/>
         <w:rPr>
-          <w:rFonts w:asciiTheme="minorHAnsi" w:hAnsiTheme="minorHAnsi" w:hint="eastAsia"/>
+          <w:rFonts w:hint="eastAsia"/>
           <w:noProof/>
-          <w:kern w:val="2"/>
-          <w:szCs w:val="24"/>
-          <w:lang w:eastAsia="zh-CN"/>
-          <w14:ligatures w14:val="standardContextual"/>
         </w:rPr>
       </w:pPr>
-      <w:hyperlink w:anchor="_Toc238056263" w:history="1">
+      <w:hyperlink w:anchor="_Toc238056922" w:history="1">
         <w:r>
           <w:rPr>
             <w:rStyle w:val="aff9"/>
@@ -2461,7 +2353,7 @@
             <w:noProof/>
             <w:webHidden/>
           </w:rPr>
-          <w:instrText>PAGEREF _Toc238056263 \h</w:instrText>
+          <w:instrText>PAGEREF _Toc238056922 \h</w:instrText>
         </w:r>
         <w:r>
           <w:rPr>
@@ -2511,15 +2403,11 @@
         </w:tabs>
         <w:ind w:left="440"/>
         <w:rPr>
-          <w:rFonts w:asciiTheme="minorHAnsi" w:hAnsiTheme="minorHAnsi" w:hint="eastAsia"/>
+          <w:rFonts w:hint="eastAsia"/>
           <w:noProof/>
-          <w:kern w:val="2"/>
-          <w:szCs w:val="24"/>
-          <w:lang w:eastAsia="zh-CN"/>
-          <w14:ligatures w14:val="standardContextual"/>
         </w:rPr>
       </w:pPr>
-      <w:hyperlink w:anchor="_Toc238056264" w:history="1">
+      <w:hyperlink w:anchor="_Toc238056923" w:history="1">
         <w:r>
           <w:rPr>
             <w:rStyle w:val="aff9"/>
@@ -2556,7 +2444,7 @@
             <w:noProof/>
             <w:webHidden/>
           </w:rPr>
-          <w:instrText>PAGEREF _Toc238056264 \h</w:instrText>
+          <w:instrText>PAGEREF _Toc238056923 \h</w:instrText>
         </w:r>
         <w:r>
           <w:rPr>
@@ -2606,15 +2494,11 @@
         </w:tabs>
         <w:ind w:left="440"/>
         <w:rPr>
-          <w:rFonts w:asciiTheme="minorHAnsi" w:hAnsiTheme="minorHAnsi" w:hint="eastAsia"/>
+          <w:rFonts w:hint="eastAsia"/>
           <w:noProof/>
-          <w:kern w:val="2"/>
-          <w:szCs w:val="24"/>
-          <w:lang w:eastAsia="zh-CN"/>
-          <w14:ligatures w14:val="standardContextual"/>
         </w:rPr>
       </w:pPr>
-      <w:hyperlink w:anchor="_Toc238056265" w:history="1">
+      <w:hyperlink w:anchor="_Toc238056924" w:history="1">
         <w:r>
           <w:rPr>
             <w:rStyle w:val="aff9"/>
@@ -2651,7 +2535,7 @@
             <w:noProof/>
             <w:webHidden/>
           </w:rPr>
-          <w:instrText>PAGEREF _Toc238056265 \h</w:instrText>
+          <w:instrText>PAGEREF _Toc238056924 \h</w:instrText>
         </w:r>
         <w:r>
           <w:rPr>
@@ -2701,15 +2585,11 @@
         </w:tabs>
         <w:ind w:left="440"/>
         <w:rPr>
-          <w:rFonts w:asciiTheme="minorHAnsi" w:hAnsiTheme="minorHAnsi" w:hint="eastAsia"/>
+          <w:rFonts w:hint="eastAsia"/>
           <w:noProof/>
-          <w:kern w:val="2"/>
-          <w:szCs w:val="24"/>
-          <w:lang w:eastAsia="zh-CN"/>
-          <w14:ligatures w14:val="standardContextual"/>
         </w:rPr>
       </w:pPr>
-      <w:hyperlink w:anchor="_Toc238056266" w:history="1">
+      <w:hyperlink w:anchor="_Toc238056925" w:history="1">
         <w:r>
           <w:rPr>
             <w:rStyle w:val="aff9"/>
@@ -2746,7 +2626,7 @@
             <w:noProof/>
             <w:webHidden/>
           </w:rPr>
-          <w:instrText>PAGEREF _Toc238056266 \h</w:instrText>
+          <w:instrText>PAGEREF _Toc238056925 \h</w:instrText>
         </w:r>
         <w:r>
           <w:rPr>
@@ -2796,15 +2676,11 @@
         </w:tabs>
         <w:ind w:left="440"/>
         <w:rPr>
-          <w:rFonts w:asciiTheme="minorHAnsi" w:hAnsiTheme="minorHAnsi" w:hint="eastAsia"/>
+          <w:rFonts w:hint="eastAsia"/>
           <w:noProof/>
-          <w:kern w:val="2"/>
-          <w:szCs w:val="24"/>
-          <w:lang w:eastAsia="zh-CN"/>
-          <w14:ligatures w14:val="standardContextual"/>
         </w:rPr>
       </w:pPr>
-      <w:hyperlink w:anchor="_Toc238056267" w:history="1">
+      <w:hyperlink w:anchor="_Toc238056926" w:history="1">
         <w:r>
           <w:rPr>
             <w:rStyle w:val="aff9"/>
@@ -2841,7 +2717,7 @@
             <w:noProof/>
             <w:webHidden/>
           </w:rPr>
-          <w:instrText>PAGEREF _Toc238056267 \h</w:instrText>
+          <w:instrText>PAGEREF _Toc238056926 \h</w:instrText>
         </w:r>
         <w:r>
           <w:rPr>
@@ -2891,15 +2767,11 @@
         </w:tabs>
         <w:ind w:left="440"/>
         <w:rPr>
-          <w:rFonts w:asciiTheme="minorHAnsi" w:hAnsiTheme="minorHAnsi" w:hint="eastAsia"/>
+          <w:rFonts w:hint="eastAsia"/>
           <w:noProof/>
-          <w:kern w:val="2"/>
-          <w:szCs w:val="24"/>
-          <w:lang w:eastAsia="zh-CN"/>
-          <w14:ligatures w14:val="standardContextual"/>
         </w:rPr>
       </w:pPr>
-      <w:hyperlink w:anchor="_Toc238056268" w:history="1">
+      <w:hyperlink w:anchor="_Toc238056927" w:history="1">
         <w:r>
           <w:rPr>
             <w:rStyle w:val="aff9"/>
@@ -2936,7 +2808,7 @@
             <w:noProof/>
             <w:webHidden/>
           </w:rPr>
-          <w:instrText>PAGEREF _Toc238056268 \h</w:instrText>
+          <w:instrText>PAGEREF _Toc238056927 \h</w:instrText>
         </w:r>
         <w:r>
           <w:rPr>
@@ -2986,15 +2858,11 @@
         </w:tabs>
         <w:ind w:left="440"/>
         <w:rPr>
-          <w:rFonts w:asciiTheme="minorHAnsi" w:hAnsiTheme="minorHAnsi" w:hint="eastAsia"/>
+          <w:rFonts w:hint="eastAsia"/>
           <w:noProof/>
-          <w:kern w:val="2"/>
-          <w:szCs w:val="24"/>
-          <w:lang w:eastAsia="zh-CN"/>
-          <w14:ligatures w14:val="standardContextual"/>
         </w:rPr>
       </w:pPr>
-      <w:hyperlink w:anchor="_Toc238056269" w:history="1">
+      <w:hyperlink w:anchor="_Toc238056928" w:history="1">
         <w:r>
           <w:rPr>
             <w:rStyle w:val="aff9"/>
@@ -3031,7 +2899,7 @@
             <w:noProof/>
             <w:webHidden/>
           </w:rPr>
-          <w:instrText>PAGEREF _Toc238056269 \h</w:instrText>
+          <w:instrText>PAGEREF _Toc238056928 \h</w:instrText>
         </w:r>
         <w:r>
           <w:rPr>
@@ -3081,15 +2949,11 @@
         </w:tabs>
         <w:ind w:left="440"/>
         <w:rPr>
-          <w:rFonts w:asciiTheme="minorHAnsi" w:hAnsiTheme="minorHAnsi" w:hint="eastAsia"/>
+          <w:rFonts w:hint="eastAsia"/>
           <w:noProof/>
-          <w:kern w:val="2"/>
-          <w:szCs w:val="24"/>
-          <w:lang w:eastAsia="zh-CN"/>
-          <w14:ligatures w14:val="standardContextual"/>
         </w:rPr>
       </w:pPr>
-      <w:hyperlink w:anchor="_Toc238056270" w:history="1">
+      <w:hyperlink w:anchor="_Toc238056929" w:history="1">
         <w:r>
           <w:rPr>
             <w:rStyle w:val="aff9"/>
@@ -3126,7 +2990,7 @@
             <w:noProof/>
             <w:webHidden/>
           </w:rPr>
-          <w:instrText>PAGEREF _Toc238056270 \h</w:instrText>
+          <w:instrText>PAGEREF _Toc238056929 \h</w:instrText>
         </w:r>
         <w:r>
           <w:rPr>
@@ -3176,15 +3040,11 @@
         </w:tabs>
         <w:ind w:left="440"/>
         <w:rPr>
-          <w:rFonts w:asciiTheme="minorHAnsi" w:hAnsiTheme="minorHAnsi" w:hint="eastAsia"/>
+          <w:rFonts w:hint="eastAsia"/>
           <w:noProof/>
-          <w:kern w:val="2"/>
-          <w:szCs w:val="24"/>
-          <w:lang w:eastAsia="zh-CN"/>
-          <w14:ligatures w14:val="standardContextual"/>
         </w:rPr>
       </w:pPr>
-      <w:hyperlink w:anchor="_Toc238056271" w:history="1">
+      <w:hyperlink w:anchor="_Toc238056930" w:history="1">
         <w:r>
           <w:rPr>
             <w:rStyle w:val="aff9"/>
@@ -3221,7 +3081,7 @@
             <w:noProof/>
             <w:webHidden/>
           </w:rPr>
-          <w:instrText>PAGEREF _Toc238056271 \h</w:instrText>
+          <w:instrText>PAGEREF _Toc238056930 \h</w:instrText>
         </w:r>
         <w:r>
           <w:rPr>
@@ -3271,15 +3131,11 @@
         </w:tabs>
         <w:ind w:left="440"/>
         <w:rPr>
-          <w:rFonts w:asciiTheme="minorHAnsi" w:hAnsiTheme="minorHAnsi" w:hint="eastAsia"/>
+          <w:rFonts w:hint="eastAsia"/>
           <w:noProof/>
-          <w:kern w:val="2"/>
-          <w:szCs w:val="24"/>
-          <w:lang w:eastAsia="zh-CN"/>
-          <w14:ligatures w14:val="standardContextual"/>
         </w:rPr>
       </w:pPr>
-      <w:hyperlink w:anchor="_Toc238056272" w:history="1">
+      <w:hyperlink w:anchor="_Toc238056931" w:history="1">
         <w:r>
           <w:rPr>
             <w:rStyle w:val="aff9"/>
@@ -3316,7 +3172,7 @@
             <w:noProof/>
             <w:webHidden/>
           </w:rPr>
-          <w:instrText>PAGEREF _Toc238056272 \h</w:instrText>
+          <w:instrText>PAGEREF _Toc238056931 \h</w:instrText>
         </w:r>
         <w:r>
           <w:rPr>
@@ -3365,15 +3221,11 @@
           <w:tab w:val="right" w:leader="dot" w:pos="9350"/>
         </w:tabs>
         <w:rPr>
-          <w:rFonts w:asciiTheme="minorHAnsi" w:hAnsiTheme="minorHAnsi" w:hint="eastAsia"/>
+          <w:rFonts w:hint="eastAsia"/>
           <w:noProof/>
-          <w:kern w:val="2"/>
-          <w:szCs w:val="24"/>
-          <w:lang w:eastAsia="zh-CN"/>
-          <w14:ligatures w14:val="standardContextual"/>
         </w:rPr>
       </w:pPr>
-      <w:hyperlink w:anchor="_Toc238056273" w:history="1">
+      <w:hyperlink w:anchor="_Toc238056932" w:history="1">
         <w:r>
           <w:rPr>
             <w:rStyle w:val="aff9"/>
@@ -3410,7 +3262,7 @@
             <w:noProof/>
             <w:webHidden/>
           </w:rPr>
-          <w:instrText>PAGEREF _Toc238056273 \h</w:instrText>
+          <w:instrText>PAGEREF _Toc238056932 \h</w:instrText>
         </w:r>
         <w:r>
           <w:rPr>
@@ -3460,15 +3312,11 @@
         </w:tabs>
         <w:ind w:left="440"/>
         <w:rPr>
-          <w:rFonts w:asciiTheme="minorHAnsi" w:hAnsiTheme="minorHAnsi" w:hint="eastAsia"/>
+          <w:rFonts w:hint="eastAsia"/>
           <w:noProof/>
-          <w:kern w:val="2"/>
-          <w:szCs w:val="24"/>
-          <w:lang w:eastAsia="zh-CN"/>
-          <w14:ligatures w14:val="standardContextual"/>
         </w:rPr>
       </w:pPr>
-      <w:hyperlink w:anchor="_Toc238056274" w:history="1">
+      <w:hyperlink w:anchor="_Toc238056933" w:history="1">
         <w:r>
           <w:rPr>
             <w:rStyle w:val="aff9"/>
@@ -3505,7 +3353,7 @@
             <w:noProof/>
             <w:webHidden/>
           </w:rPr>
-          <w:instrText>PAGEREF _Toc238056274 \h</w:instrText>
+          <w:instrText>PAGEREF _Toc238056933 \h</w:instrText>
         </w:r>
         <w:r>
           <w:rPr>
@@ -3555,15 +3403,11 @@
         </w:tabs>
         <w:ind w:left="440"/>
         <w:rPr>
-          <w:rFonts w:asciiTheme="minorHAnsi" w:hAnsiTheme="minorHAnsi" w:hint="eastAsia"/>
+          <w:rFonts w:hint="eastAsia"/>
           <w:noProof/>
-          <w:kern w:val="2"/>
-          <w:szCs w:val="24"/>
-          <w:lang w:eastAsia="zh-CN"/>
-          <w14:ligatures w14:val="standardContextual"/>
         </w:rPr>
       </w:pPr>
-      <w:hyperlink w:anchor="_Toc238056275" w:history="1">
+      <w:hyperlink w:anchor="_Toc238056934" w:history="1">
         <w:r>
           <w:rPr>
             <w:rStyle w:val="aff9"/>
@@ -3600,7 +3444,7 @@
             <w:noProof/>
             <w:webHidden/>
           </w:rPr>
-          <w:instrText>PAGEREF _Toc238056275 \h</w:instrText>
+          <w:instrText>PAGEREF _Toc238056934 \h</w:instrText>
         </w:r>
         <w:r>
           <w:rPr>
@@ -3650,15 +3494,11 @@
         </w:tabs>
         <w:ind w:left="440"/>
         <w:rPr>
-          <w:rFonts w:asciiTheme="minorHAnsi" w:hAnsiTheme="minorHAnsi" w:hint="eastAsia"/>
+          <w:rFonts w:hint="eastAsia"/>
           <w:noProof/>
-          <w:kern w:val="2"/>
-          <w:szCs w:val="24"/>
-          <w:lang w:eastAsia="zh-CN"/>
-          <w14:ligatures w14:val="standardContextual"/>
         </w:rPr>
       </w:pPr>
-      <w:hyperlink w:anchor="_Toc238056276" w:history="1">
+      <w:hyperlink w:anchor="_Toc238056935" w:history="1">
         <w:r>
           <w:rPr>
             <w:rStyle w:val="aff9"/>
@@ -3695,7 +3535,7 @@
             <w:noProof/>
             <w:webHidden/>
           </w:rPr>
-          <w:instrText>PAGEREF _Toc238056276 \h</w:instrText>
+          <w:instrText>PAGEREF _Toc238056935 \h</w:instrText>
         </w:r>
         <w:r>
           <w:rPr>
@@ -3745,15 +3585,11 @@
         </w:tabs>
         <w:ind w:left="440"/>
         <w:rPr>
-          <w:rFonts w:asciiTheme="minorHAnsi" w:hAnsiTheme="minorHAnsi" w:hint="eastAsia"/>
+          <w:rFonts w:hint="eastAsia"/>
           <w:noProof/>
-          <w:kern w:val="2"/>
-          <w:szCs w:val="24"/>
-          <w:lang w:eastAsia="zh-CN"/>
-          <w14:ligatures w14:val="standardContextual"/>
         </w:rPr>
       </w:pPr>
-      <w:hyperlink w:anchor="_Toc238056277" w:history="1">
+      <w:hyperlink w:anchor="_Toc238056936" w:history="1">
         <w:r>
           <w:rPr>
             <w:rStyle w:val="aff9"/>
@@ -3790,7 +3626,7 @@
             <w:noProof/>
             <w:webHidden/>
           </w:rPr>
-          <w:instrText>PAGEREF _Toc238056277 \h</w:instrText>
+          <w:instrText>PAGEREF _Toc238056936 \h</w:instrText>
         </w:r>
         <w:r>
           <w:rPr>
@@ -3840,15 +3676,11 @@
         </w:tabs>
         <w:ind w:left="440"/>
         <w:rPr>
-          <w:rFonts w:asciiTheme="minorHAnsi" w:hAnsiTheme="minorHAnsi" w:hint="eastAsia"/>
+          <w:rFonts w:hint="eastAsia"/>
           <w:noProof/>
-          <w:kern w:val="2"/>
-          <w:szCs w:val="24"/>
-          <w:lang w:eastAsia="zh-CN"/>
-          <w14:ligatures w14:val="standardContextual"/>
         </w:rPr>
       </w:pPr>
-      <w:hyperlink w:anchor="_Toc238056278" w:history="1">
+      <w:hyperlink w:anchor="_Toc238056937" w:history="1">
         <w:r>
           <w:rPr>
             <w:rStyle w:val="aff9"/>
@@ -3885,7 +3717,7 @@
             <w:noProof/>
             <w:webHidden/>
           </w:rPr>
-          <w:instrText>PAGEREF _Toc238056278 \h</w:instrText>
+          <w:instrText>PAGEREF _Toc238056937 \h</w:instrText>
         </w:r>
         <w:r>
           <w:rPr>
@@ -3915,7 +3747,7 @@
             <w:noProof/>
             <w:webHidden/>
           </w:rPr>
-          <w:t>21</w:t>
+          <w:t>22</w:t>
         </w:r>
         <w:r>
           <w:rPr>
@@ -3935,15 +3767,11 @@
         </w:tabs>
         <w:ind w:left="440"/>
         <w:rPr>
-          <w:rFonts w:asciiTheme="minorHAnsi" w:hAnsiTheme="minorHAnsi" w:hint="eastAsia"/>
+          <w:rFonts w:hint="eastAsia"/>
           <w:noProof/>
-          <w:kern w:val="2"/>
-          <w:szCs w:val="24"/>
-          <w:lang w:eastAsia="zh-CN"/>
-          <w14:ligatures w14:val="standardContextual"/>
         </w:rPr>
       </w:pPr>
-      <w:hyperlink w:anchor="_Toc238056279" w:history="1">
+      <w:hyperlink w:anchor="_Toc238056938" w:history="1">
         <w:r>
           <w:rPr>
             <w:rStyle w:val="aff9"/>
@@ -3980,7 +3808,7 @@
             <w:noProof/>
             <w:webHidden/>
           </w:rPr>
-          <w:instrText>PAGEREF _Toc238056279 \h</w:instrText>
+          <w:instrText>PAGEREF _Toc238056938 \h</w:instrText>
         </w:r>
         <w:r>
           <w:rPr>
@@ -4030,15 +3858,11 @@
         </w:tabs>
         <w:ind w:left="440"/>
         <w:rPr>
-          <w:rFonts w:asciiTheme="minorHAnsi" w:hAnsiTheme="minorHAnsi" w:hint="eastAsia"/>
+          <w:rFonts w:hint="eastAsia"/>
           <w:noProof/>
-          <w:kern w:val="2"/>
-          <w:szCs w:val="24"/>
-          <w:lang w:eastAsia="zh-CN"/>
-          <w14:ligatures w14:val="standardContextual"/>
         </w:rPr>
       </w:pPr>
-      <w:hyperlink w:anchor="_Toc238056280" w:history="1">
+      <w:hyperlink w:anchor="_Toc238056939" w:history="1">
         <w:r>
           <w:rPr>
             <w:rStyle w:val="aff9"/>
@@ -4075,7 +3899,7 @@
             <w:noProof/>
             <w:webHidden/>
           </w:rPr>
-          <w:instrText>PAGEREF _Toc238056280 \h</w:instrText>
+          <w:instrText>PAGEREF _Toc238056939 \h</w:instrText>
         </w:r>
         <w:r>
           <w:rPr>
@@ -4124,15 +3948,11 @@
           <w:tab w:val="right" w:leader="dot" w:pos="9350"/>
         </w:tabs>
         <w:rPr>
-          <w:rFonts w:asciiTheme="minorHAnsi" w:hAnsiTheme="minorHAnsi" w:hint="eastAsia"/>
+          <w:rFonts w:hint="eastAsia"/>
           <w:noProof/>
-          <w:kern w:val="2"/>
-          <w:szCs w:val="24"/>
-          <w:lang w:eastAsia="zh-CN"/>
-          <w14:ligatures w14:val="standardContextual"/>
         </w:rPr>
       </w:pPr>
-      <w:hyperlink w:anchor="_Toc238056281" w:history="1">
+      <w:hyperlink w:anchor="_Toc238056940" w:history="1">
         <w:r>
           <w:rPr>
             <w:rStyle w:val="aff9"/>
@@ -4169,7 +3989,7 @@
             <w:noProof/>
             <w:webHidden/>
           </w:rPr>
-          <w:instrText>PAGEREF _Toc238056281 \h</w:instrText>
+          <w:instrText>PAGEREF _Toc238056940 \h</w:instrText>
         </w:r>
         <w:r>
           <w:rPr>
@@ -4219,15 +4039,11 @@
         </w:tabs>
         <w:ind w:left="440"/>
         <w:rPr>
-          <w:rFonts w:asciiTheme="minorHAnsi" w:hAnsiTheme="minorHAnsi" w:hint="eastAsia"/>
+          <w:rFonts w:hint="eastAsia"/>
           <w:noProof/>
-          <w:kern w:val="2"/>
-          <w:szCs w:val="24"/>
-          <w:lang w:eastAsia="zh-CN"/>
-          <w14:ligatures w14:val="standardContextual"/>
         </w:rPr>
       </w:pPr>
-      <w:hyperlink w:anchor="_Toc238056282" w:history="1">
+      <w:hyperlink w:anchor="_Toc238056941" w:history="1">
         <w:r>
           <w:rPr>
             <w:rStyle w:val="aff9"/>
@@ -4264,7 +4080,7 @@
             <w:noProof/>
             <w:webHidden/>
           </w:rPr>
-          <w:instrText>PAGEREF _Toc238056282 \h</w:instrText>
+          <w:instrText>PAGEREF _Toc238056941 \h</w:instrText>
         </w:r>
         <w:r>
           <w:rPr>
@@ -4314,15 +4130,11 @@
         </w:tabs>
         <w:ind w:left="880"/>
         <w:rPr>
-          <w:rFonts w:asciiTheme="minorHAnsi" w:hAnsiTheme="minorHAnsi" w:hint="eastAsia"/>
+          <w:rFonts w:hint="eastAsia"/>
           <w:noProof/>
-          <w:kern w:val="2"/>
-          <w:szCs w:val="24"/>
-          <w:lang w:eastAsia="zh-CN"/>
-          <w14:ligatures w14:val="standardContextual"/>
         </w:rPr>
       </w:pPr>
-      <w:hyperlink w:anchor="_Toc238056283" w:history="1">
+      <w:hyperlink w:anchor="_Toc238056942" w:history="1">
         <w:r>
           <w:rPr>
             <w:rStyle w:val="aff9"/>
@@ -4359,7 +4171,7 @@
             <w:noProof/>
             <w:webHidden/>
           </w:rPr>
-          <w:instrText>PAGEREF _Toc238056283 \h</w:instrText>
+          <w:instrText>PAGEREF _Toc238056942 \h</w:instrText>
         </w:r>
         <w:r>
           <w:rPr>
@@ -4409,15 +4221,11 @@
         </w:tabs>
         <w:ind w:left="880"/>
         <w:rPr>
-          <w:rFonts w:asciiTheme="minorHAnsi" w:hAnsiTheme="minorHAnsi" w:hint="eastAsia"/>
+          <w:rFonts w:hint="eastAsia"/>
           <w:noProof/>
-          <w:kern w:val="2"/>
-          <w:szCs w:val="24"/>
-          <w:lang w:eastAsia="zh-CN"/>
-          <w14:ligatures w14:val="standardContextual"/>
         </w:rPr>
       </w:pPr>
-      <w:hyperlink w:anchor="_Toc238056284" w:history="1">
+      <w:hyperlink w:anchor="_Toc238056943" w:history="1">
         <w:r>
           <w:rPr>
             <w:rStyle w:val="aff9"/>
@@ -4454,7 +4262,7 @@
             <w:noProof/>
             <w:webHidden/>
           </w:rPr>
-          <w:instrText>PAGEREF _Toc238056284 \h</w:instrText>
+          <w:instrText>PAGEREF _Toc238056943 \h</w:instrText>
         </w:r>
         <w:r>
           <w:rPr>
@@ -4504,15 +4312,11 @@
         </w:tabs>
         <w:ind w:left="880"/>
         <w:rPr>
-          <w:rFonts w:asciiTheme="minorHAnsi" w:hAnsiTheme="minorHAnsi" w:hint="eastAsia"/>
+          <w:rFonts w:hint="eastAsia"/>
           <w:noProof/>
-          <w:kern w:val="2"/>
-          <w:szCs w:val="24"/>
-          <w:lang w:eastAsia="zh-CN"/>
-          <w14:ligatures w14:val="standardContextual"/>
         </w:rPr>
       </w:pPr>
-      <w:hyperlink w:anchor="_Toc238056285" w:history="1">
+      <w:hyperlink w:anchor="_Toc238056944" w:history="1">
         <w:r>
           <w:rPr>
             <w:rStyle w:val="aff9"/>
@@ -4549,15 +4353,7 @@
             <w:noProof/>
             <w:webHidden/>
           </w:rPr>
-          <w:instrText>PAGEREF _Toc23805628</w:instrText>
-        </w:r>
-        <w:r>
-          <w:rPr>
-            <w:noProof/>
-            <w:webHidden/>
-          </w:rPr>
-          <w:lastRenderedPageBreak/>
-          <w:instrText>5 \h</w:instrText>
+          <w:instrText>PAGEREF _Toc238056944 \h</w:instrText>
         </w:r>
         <w:r>
           <w:rPr>
@@ -4607,15 +4403,11 @@
         </w:tabs>
         <w:ind w:left="880"/>
         <w:rPr>
-          <w:rFonts w:asciiTheme="minorHAnsi" w:hAnsiTheme="minorHAnsi" w:hint="eastAsia"/>
+          <w:rFonts w:hint="eastAsia"/>
           <w:noProof/>
-          <w:kern w:val="2"/>
-          <w:szCs w:val="24"/>
-          <w:lang w:eastAsia="zh-CN"/>
-          <w14:ligatures w14:val="standardContextual"/>
         </w:rPr>
       </w:pPr>
-      <w:hyperlink w:anchor="_Toc238056286" w:history="1">
+      <w:hyperlink w:anchor="_Toc238056945" w:history="1">
         <w:r>
           <w:rPr>
             <w:rStyle w:val="aff9"/>
@@ -4652,7 +4444,7 @@
             <w:noProof/>
             <w:webHidden/>
           </w:rPr>
-          <w:instrText>PAGEREF _Toc238056286 \h</w:instrText>
+          <w:instrText>PAGEREF _Toc238056945 \h</w:instrText>
         </w:r>
         <w:r>
           <w:rPr>
@@ -4702,15 +4494,11 @@
         </w:tabs>
         <w:ind w:left="440"/>
         <w:rPr>
-          <w:rFonts w:asciiTheme="minorHAnsi" w:hAnsiTheme="minorHAnsi" w:hint="eastAsia"/>
+          <w:rFonts w:hint="eastAsia"/>
           <w:noProof/>
-          <w:kern w:val="2"/>
-          <w:szCs w:val="24"/>
-          <w:lang w:eastAsia="zh-CN"/>
-          <w14:ligatures w14:val="standardContextual"/>
         </w:rPr>
       </w:pPr>
-      <w:hyperlink w:anchor="_Toc238056287" w:history="1">
+      <w:hyperlink w:anchor="_Toc238056946" w:history="1">
         <w:r>
           <w:rPr>
             <w:rStyle w:val="aff9"/>
@@ -4747,7 +4535,7 @@
             <w:noProof/>
             <w:webHidden/>
           </w:rPr>
-          <w:instrText>PAGEREF _Toc238056287 \h</w:instrText>
+          <w:instrText>PAGEREF _Toc238056946 \h</w:instrText>
         </w:r>
         <w:r>
           <w:rPr>
@@ -4797,15 +4585,11 @@
         </w:tabs>
         <w:ind w:left="440"/>
         <w:rPr>
-          <w:rFonts w:asciiTheme="minorHAnsi" w:hAnsiTheme="minorHAnsi" w:hint="eastAsia"/>
+          <w:rFonts w:hint="eastAsia"/>
           <w:noProof/>
-          <w:kern w:val="2"/>
-          <w:szCs w:val="24"/>
-          <w:lang w:eastAsia="zh-CN"/>
-          <w14:ligatures w14:val="standardContextual"/>
         </w:rPr>
       </w:pPr>
-      <w:hyperlink w:anchor="_Toc238056288" w:history="1">
+      <w:hyperlink w:anchor="_Toc238056947" w:history="1">
         <w:r>
           <w:rPr>
             <w:rStyle w:val="aff9"/>
@@ -4842,7 +4626,7 @@
             <w:noProof/>
             <w:webHidden/>
           </w:rPr>
-          <w:instrText>PAGEREF _Toc238056288 \h</w:instrText>
+          <w:instrText>PAGEREF _Toc238056947 \h</w:instrText>
         </w:r>
         <w:r>
           <w:rPr>
@@ -4892,15 +4676,11 @@
         </w:tabs>
         <w:ind w:left="440"/>
         <w:rPr>
-          <w:rFonts w:asciiTheme="minorHAnsi" w:hAnsiTheme="minorHAnsi" w:hint="eastAsia"/>
+          <w:rFonts w:hint="eastAsia"/>
           <w:noProof/>
-          <w:kern w:val="2"/>
-          <w:szCs w:val="24"/>
-          <w:lang w:eastAsia="zh-CN"/>
-          <w14:ligatures w14:val="standardContextual"/>
         </w:rPr>
       </w:pPr>
-      <w:hyperlink w:anchor="_Toc238056289" w:history="1">
+      <w:hyperlink w:anchor="_Toc238056948" w:history="1">
         <w:r>
           <w:rPr>
             <w:rStyle w:val="aff9"/>
@@ -4937,7 +4717,7 @@
             <w:noProof/>
             <w:webHidden/>
           </w:rPr>
-          <w:instrText>PAGEREF _Toc238056289 \h</w:instrText>
+          <w:instrText>PAGEREF _Toc238056948 \h</w:instrText>
         </w:r>
         <w:r>
           <w:rPr>
@@ -4987,15 +4767,11 @@
         </w:tabs>
         <w:ind w:left="440"/>
         <w:rPr>
-          <w:rFonts w:asciiTheme="minorHAnsi" w:hAnsiTheme="minorHAnsi" w:hint="eastAsia"/>
+          <w:rFonts w:hint="eastAsia"/>
           <w:noProof/>
-          <w:kern w:val="2"/>
-          <w:szCs w:val="24"/>
-          <w:lang w:eastAsia="zh-CN"/>
-          <w14:ligatures w14:val="standardContextual"/>
         </w:rPr>
       </w:pPr>
-      <w:hyperlink w:anchor="_Toc238056290" w:history="1">
+      <w:hyperlink w:anchor="_Toc238056949" w:history="1">
         <w:r>
           <w:rPr>
             <w:rStyle w:val="aff9"/>
@@ -5032,7 +4808,7 @@
             <w:noProof/>
             <w:webHidden/>
           </w:rPr>
-          <w:instrText>PAGEREF _Toc238056290 \h</w:instrText>
+          <w:instrText>PAGEREF _Toc238056949 \h</w:instrText>
         </w:r>
         <w:r>
           <w:rPr>
@@ -5082,15 +4858,11 @@
         </w:tabs>
         <w:ind w:left="440"/>
         <w:rPr>
-          <w:rFonts w:asciiTheme="minorHAnsi" w:hAnsiTheme="minorHAnsi" w:hint="eastAsia"/>
+          <w:rFonts w:hint="eastAsia"/>
           <w:noProof/>
-          <w:kern w:val="2"/>
-          <w:szCs w:val="24"/>
-          <w:lang w:eastAsia="zh-CN"/>
-          <w14:ligatures w14:val="standardContextual"/>
         </w:rPr>
       </w:pPr>
-      <w:hyperlink w:anchor="_Toc238056291" w:history="1">
+      <w:hyperlink w:anchor="_Toc238056950" w:history="1">
         <w:r>
           <w:rPr>
             <w:rStyle w:val="aff9"/>
@@ -5127,7 +4899,7 @@
             <w:noProof/>
             <w:webHidden/>
           </w:rPr>
-          <w:instrText>PAGEREF _Toc238056291 \h</w:instrText>
+          <w:instrText>PAGEREF _Toc238056950 \h</w:instrText>
         </w:r>
         <w:r>
           <w:rPr>
@@ -5176,15 +4948,11 @@
           <w:tab w:val="right" w:leader="dot" w:pos="9350"/>
         </w:tabs>
         <w:rPr>
-          <w:rFonts w:asciiTheme="minorHAnsi" w:hAnsiTheme="minorHAnsi" w:hint="eastAsia"/>
+          <w:rFonts w:hint="eastAsia"/>
           <w:noProof/>
-          <w:kern w:val="2"/>
-          <w:szCs w:val="24"/>
-          <w:lang w:eastAsia="zh-CN"/>
-          <w14:ligatures w14:val="standardContextual"/>
         </w:rPr>
       </w:pPr>
-      <w:hyperlink w:anchor="_Toc238056292" w:history="1">
+      <w:hyperlink w:anchor="_Toc238056951" w:history="1">
         <w:r>
           <w:rPr>
             <w:rStyle w:val="aff9"/>
@@ -5221,7 +4989,7 @@
             <w:noProof/>
             <w:webHidden/>
           </w:rPr>
-          <w:instrText>PAGEREF _Toc238056292 \h</w:instrText>
+          <w:instrText>PAGEREF _Toc238056951 \h</w:instrText>
         </w:r>
         <w:r>
           <w:rPr>
@@ -5270,15 +5038,11 @@
           <w:tab w:val="right" w:leader="dot" w:pos="9350"/>
         </w:tabs>
         <w:rPr>
-          <w:rFonts w:asciiTheme="minorHAnsi" w:hAnsiTheme="minorHAnsi" w:hint="eastAsia"/>
+          <w:rFonts w:hint="eastAsia"/>
           <w:noProof/>
-          <w:kern w:val="2"/>
-          <w:szCs w:val="24"/>
-          <w:lang w:eastAsia="zh-CN"/>
-          <w14:ligatures w14:val="standardContextual"/>
         </w:rPr>
       </w:pPr>
-      <w:hyperlink w:anchor="_Toc238056293" w:history="1">
+      <w:hyperlink w:anchor="_Toc238056952" w:history="1">
         <w:r>
           <w:rPr>
             <w:rStyle w:val="aff9"/>
@@ -5315,7 +5079,7 @@
             <w:noProof/>
             <w:webHidden/>
           </w:rPr>
-          <w:instrText>PAGEREF _Toc238056293 \h</w:instrText>
+          <w:instrText>PAGEREF _Toc238056952 \h</w:instrText>
         </w:r>
         <w:r>
           <w:rPr>
@@ -5365,15 +5129,11 @@
         </w:tabs>
         <w:ind w:left="440"/>
         <w:rPr>
-          <w:rFonts w:asciiTheme="minorHAnsi" w:hAnsiTheme="minorHAnsi" w:hint="eastAsia"/>
+          <w:rFonts w:hint="eastAsia"/>
           <w:noProof/>
-          <w:kern w:val="2"/>
-          <w:szCs w:val="24"/>
-          <w:lang w:eastAsia="zh-CN"/>
-          <w14:ligatures w14:val="standardContextual"/>
         </w:rPr>
       </w:pPr>
-      <w:hyperlink w:anchor="_Toc238056294" w:history="1">
+      <w:hyperlink w:anchor="_Toc238056953" w:history="1">
         <w:r>
           <w:rPr>
             <w:rStyle w:val="aff9"/>
@@ -5410,7 +5170,7 @@
             <w:noProof/>
             <w:webHidden/>
           </w:rPr>
-          <w:instrText>PAGEREF _Toc238056294 \h</w:instrText>
+          <w:instrText>PAGEREF _Toc238056953 \h</w:instrText>
         </w:r>
         <w:r>
           <w:rPr>
@@ -5460,15 +5220,11 @@
         </w:tabs>
         <w:ind w:left="440"/>
         <w:rPr>
-          <w:rFonts w:asciiTheme="minorHAnsi" w:hAnsiTheme="minorHAnsi" w:hint="eastAsia"/>
+          <w:rFonts w:hint="eastAsia"/>
           <w:noProof/>
-          <w:kern w:val="2"/>
-          <w:szCs w:val="24"/>
-          <w:lang w:eastAsia="zh-CN"/>
-          <w14:ligatures w14:val="standardContextual"/>
         </w:rPr>
       </w:pPr>
-      <w:hyperlink w:anchor="_Toc238056295" w:history="1">
+      <w:hyperlink w:anchor="_Toc238056954" w:history="1">
         <w:r>
           <w:rPr>
             <w:rStyle w:val="aff9"/>
@@ -5505,7 +5261,7 @@
             <w:noProof/>
             <w:webHidden/>
           </w:rPr>
-          <w:instrText>PAGEREF _Toc238056295 \h</w:instrText>
+          <w:instrText>PAGEREF _Toc238056954 \h</w:instrText>
         </w:r>
         <w:r>
           <w:rPr>
@@ -5555,15 +5311,11 @@
         </w:tabs>
         <w:ind w:left="440"/>
         <w:rPr>
-          <w:rFonts w:asciiTheme="minorHAnsi" w:hAnsiTheme="minorHAnsi" w:hint="eastAsia"/>
+          <w:rFonts w:hint="eastAsia"/>
           <w:noProof/>
-          <w:kern w:val="2"/>
-          <w:szCs w:val="24"/>
-          <w:lang w:eastAsia="zh-CN"/>
-          <w14:ligatures w14:val="standardContextual"/>
         </w:rPr>
       </w:pPr>
-      <w:hyperlink w:anchor="_Toc238056296" w:history="1">
+      <w:hyperlink w:anchor="_Toc238056955" w:history="1">
         <w:r>
           <w:rPr>
             <w:rStyle w:val="aff9"/>
@@ -5600,7 +5352,7 @@
             <w:noProof/>
             <w:webHidden/>
           </w:rPr>
-          <w:instrText>PAGEREF _Toc238056296 \h</w:instrText>
+          <w:instrText>PAGEREF _Toc238056955 \h</w:instrText>
         </w:r>
         <w:r>
           <w:rPr>
@@ -5650,15 +5402,11 @@
         </w:tabs>
         <w:ind w:left="440"/>
         <w:rPr>
-          <w:rFonts w:asciiTheme="minorHAnsi" w:hAnsiTheme="minorHAnsi" w:hint="eastAsia"/>
+          <w:rFonts w:hint="eastAsia"/>
           <w:noProof/>
-          <w:kern w:val="2"/>
-          <w:szCs w:val="24"/>
-          <w:lang w:eastAsia="zh-CN"/>
-          <w14:ligatures w14:val="standardContextual"/>
         </w:rPr>
       </w:pPr>
-      <w:hyperlink w:anchor="_Toc238056297" w:history="1">
+      <w:hyperlink w:anchor="_Toc238056956" w:history="1">
         <w:r>
           <w:rPr>
             <w:rStyle w:val="aff9"/>
@@ -5695,7 +5443,7 @@
             <w:noProof/>
             <w:webHidden/>
           </w:rPr>
-          <w:instrText>PAGEREF _Toc238056297 \h</w:instrText>
+          <w:instrText>PAGEREF _Toc238056956 \h</w:instrText>
         </w:r>
         <w:r>
           <w:rPr>
@@ -5745,15 +5493,11 @@
         </w:tabs>
         <w:ind w:left="440"/>
         <w:rPr>
-          <w:rFonts w:asciiTheme="minorHAnsi" w:hAnsiTheme="minorHAnsi" w:hint="eastAsia"/>
+          <w:rFonts w:hint="eastAsia"/>
           <w:noProof/>
-          <w:kern w:val="2"/>
-          <w:szCs w:val="24"/>
-          <w:lang w:eastAsia="zh-CN"/>
-          <w14:ligatures w14:val="standardContextual"/>
         </w:rPr>
       </w:pPr>
-      <w:hyperlink w:anchor="_Toc238056298" w:history="1">
+      <w:hyperlink w:anchor="_Toc238056957" w:history="1">
         <w:r>
           <w:rPr>
             <w:rStyle w:val="aff9"/>
@@ -5790,7 +5534,7 @@
             <w:noProof/>
             <w:webHidden/>
           </w:rPr>
-          <w:instrText>PAGEREF _Toc238056298 \h</w:instrText>
+          <w:instrText>PAGEREF _Toc238056957 \h</w:instrText>
         </w:r>
         <w:r>
           <w:rPr>
@@ -5859,7 +5603,7 @@
       <w:pPr>
         <w:pStyle w:val="21"/>
       </w:pPr>
-      <w:bookmarkStart w:id="0" w:name="_Toc238056239"/>
+      <w:bookmarkStart w:id="0" w:name="_Toc238056898"/>
       <w:r>
         <w:rPr>
           <w:rFonts w:ascii="Calibri" w:hAnsi="Calibri"/>
@@ -5871,22 +5615,34 @@
     </w:p>
     <w:p>
       <w:r>
-        <w:t>Retrieval-augmented generation can provide external evidence for medical question answering, but a fluent answer may still be grounded in the wrong patient's report. In radiology, linked images, indications, findings, and impressions form a case-level evidence unit. This research develops and critically evaluates a retrieval-augmented question-answering workflow over paired chest X-ray images and reports using de-identified OpenI/IU-Xray cases. The study asks whether correctly aligned image representations improve target-report retrieval beyond question and indication text, whether the effect depends on correct image-report alignment, and whether retrieval gains transfer to downstream report-grounded answers.</w:t>
-      </w:r>
-    </w:p>
-    <w:p>
-      <w:r>
-        <w:t>The final V5 experiment used 240 fresh cases, divided into 120 development and 120 confirmation cases, with 360 confirmation questions. BM25 provided text retrieval, while BioViL-T supplied 128-dimensional paired image-report representations for reranking. Four principal conditions compared question-only text, indication plus question, question plus correctly aligned image, and indication plus question plus correctly aligned image. One hundred fixed-point-free shuffled-image permutations provided an alignment control. The top-ranked report was passed through a fixed local Qwen2.5-1.5B-Instruct generator and an automated Medical-NLI evidence checker.</w:t>
-      </w:r>
-    </w:p>
-    <w:p>
-      <w:r>
-        <w:t>Indication text was the strongest retrieval signal: MRR increased from 0.0277 for question-only BM25 to 0.6590 for indication-plus-question BM25. Adding the correctly aligned image increased MRR to 0.6971 and extractive proxy Token-F1 from 0.6602 to 0.7245. The MRR difference was 0.0381 with case-bootstrap 95% CI [0.0159, 0.0614] and paired-randomization p=0.0012. No shuffled-image run reached the correctly aligned MRR or proxy Token-F1; the plus-one Monte Carlo value was 0.0099 for both metrics. Under the fixed downstream pipeline, multimodal retrieval improved final Token-F1 by 0.0302, CI [0.0101, 0.0511], p=0.0032, but automated support rate decreased by 0.0340.</w:t>
-      </w:r>
-    </w:p>
-    <w:p>
-      <w:r>
-        <w:t>A frozen 24-question qualitative review explained this trade-off. The researcher accepted all refined taxonomy v1.1 proposals. Target-rank improvement did not always produce Top-1 success; answers could be faithful to a retrieved report that was misaligned with the frozen target case; correct retrieval did not guarantee a reference-consistent final answer; and automated verification sometimes appeared to remove report-supported content. Other support declines reflected only template-prefix filtering rather than substantive answer loss.</w:t>
+        <w:t xml:space="preserve">Retrieval-augmented generation can provide external evidence for medical question answering, but a fluent answer may still be grounded in the wrong patient's report. In radiology, linked images, indications, findings, and impressions form a case-level evidence unit. This research develops and critically evaluates a retrieval-augmented question-answering workflow over paired chest X-ray images and reports using de-identified OpenI/IU-Xray cases. The study asks whether correctly aligned image representations </w:t>
+      </w:r>
+      <w:r>
+        <w:t>improve target-report retrieval beyond question and indication text, whether the effect depends on correct image-report alignment, and whether retrieval gains transfer to downstream report-grounded answers.</w:t>
+      </w:r>
+    </w:p>
+    <w:p>
+      <w:r>
+        <w:t>The final V5 experiment used 240 fresh cases, divided into 120 development and 120 confirmation cases, with 360 confirmation questions. BM25 provided text retrieval, while BioViL-T supplied 128-dimensional paired image-report representations for reranking. Four principal conditions compared question-only text, indication plus question, question plus correctly aligned image, and indication plus question plus correctly aligned image. One hundred fixed-point-free shuffled-image permutations provided an alignme</w:t>
+      </w:r>
+      <w:r>
+        <w:t>nt control. The top-ranked report was passed through a fixed local Qwen2.5-1.5B-Instruct generator and an automated Medical-NLI evidence checker.</w:t>
+      </w:r>
+    </w:p>
+    <w:p>
+      <w:r>
+        <w:t xml:space="preserve">Indication text was the strongest retrieval signal: MRR increased from 0.0277 for question-only BM25 to 0.6590 for indication-plus-question BM25. Adding the correctly aligned image increased MRR to 0.6971 and extractive proxy Token-F1 from 0.6602 to 0.7245. The MRR difference was 0.0381 with case-bootstrap 95% CI [0.0159, 0.0614] and paired-randomization p=0.0012. No shuffled-image run reached the correctly aligned MRR or proxy Token-F1; the plus-one Monte Carlo value was 0.0099 for both metrics. Under the </w:t>
+      </w:r>
+      <w:r>
+        <w:t>fixed downstream pipeline, multimodal retrieval improved final Token-F1 by 0.0302, CI [0.0101, 0.0511], p=0.0032, but automated support rate decreased by 0.0340.</w:t>
+      </w:r>
+    </w:p>
+    <w:p>
+      <w:r>
+        <w:t xml:space="preserve">A frozen 24-question qualitative review explained this trade-off. The researcher accepted all refined taxonomy v1.1 proposals. Target-rank improvement did not always produce Top-1 success; answers could be faithful to a retrieved report that was misaligned with the frozen target case; correct retrieval did not guarantee a reference-consistent final answer; and automated verification sometimes appeared to remove report-supported content. Other support declines reflected only template-prefix filtering rather </w:t>
+      </w:r>
+      <w:r>
+        <w:t>than substantive answer loss.</w:t>
       </w:r>
     </w:p>
     <w:p>
@@ -5911,7 +5667,7 @@
         <w:pStyle w:val="1"/>
         <w:pageBreakBefore/>
       </w:pPr>
-      <w:bookmarkStart w:id="1" w:name="_Toc238056240"/>
+      <w:bookmarkStart w:id="1" w:name="_Toc238056899"/>
       <w:r>
         <w:rPr>
           <w:rFonts w:ascii="Calibri" w:hAnsi="Calibri"/>
@@ -5925,7 +5681,7 @@
       <w:pPr>
         <w:pStyle w:val="21"/>
       </w:pPr>
-      <w:bookmarkStart w:id="2" w:name="_Toc238056241"/>
+      <w:bookmarkStart w:id="2" w:name="_Toc238056900"/>
       <w:r>
         <w:rPr>
           <w:rFonts w:ascii="Calibri" w:hAnsi="Calibri"/>
@@ -5946,12 +5702,18 @@
     </w:p>
     <w:p>
       <w:r>
-        <w:t>These distinctions are especially important in radiology. A radiology examination links an indication, one or more images, findings, and an impression. The report and images describe the same case, but they contribute different signals. Indication text may contain strong lexical clues. Image representations may help distinguish visually different examinations. Report text supplies the evidence from which an answer can be generated. If these elements are separated or mismatched, an answer may remain coherent while referring to the wrong case.</w:t>
-      </w:r>
-    </w:p>
-    <w:p>
-      <w:r>
-        <w:t>The OpenI/IU-Xray collection contains de-identified chest radiograph examinations with linked reports and images (Demner-Fushman et al., 2016). It enables controlled study of paired image-report retrieval without requiring proprietary hospital data. Biomedical vision-language models such as BioViL and BioViL-T provide joint representations of radiology images and reports (Boecking et al., 2022; Bannur et al., 2023), creating an opportunity to test whether image information improves report retrieval rather than merely decorating a text-only interface.</w:t>
+        <w:t>These distinctions are especially important in radiology. A radiology examination links an indication, one or more images, findings, and an impression. The report and images describe the same case, but they contribute different signals. Indication text may contain strong lexical clues. Image representations may help distinguish visually different examinations. Report text supplies the evidence from which an answer can be generated. If these elements are separated or mismatched, an answer may remain coherent</w:t>
+      </w:r>
+      <w:r>
+        <w:t xml:space="preserve"> while referring to the wrong case.</w:t>
+      </w:r>
+    </w:p>
+    <w:p>
+      <w:r>
+        <w:t>The OpenI/IU-Xray collection contains de-identified chest radiograph examinations with linked reports and images (Demner-Fushman et al., 2016). It enables controlled study of paired image-report retrieval without requiring proprietary hospital data. Biomedical vision-language models such as BioViL and BioViL-T provide joint representations of radiology images and reports (Boecking et al., 2022; Bannur et al., 2023), creating an opportunity to test whether image information improves report retrieval rather t</w:t>
+      </w:r>
+      <w:r>
+        <w:t>han merely decorating a text-only interface.</w:t>
       </w:r>
     </w:p>
     <w:p>
@@ -5963,7 +5725,7 @@
       <w:pPr>
         <w:pStyle w:val="21"/>
       </w:pPr>
-      <w:bookmarkStart w:id="3" w:name="_Toc238056242"/>
+      <w:bookmarkStart w:id="3" w:name="_Toc238056901"/>
       <w:r>
         <w:rPr>
           <w:rFonts w:ascii="Calibri" w:hAnsi="Calibri"/>
@@ -5989,6 +5751,9 @@
     <w:p>
       <w:pPr>
         <w:pStyle w:val="CodeBlock"/>
+        <w:rPr>
+          <w:rFonts w:hint="eastAsia"/>
+        </w:rPr>
       </w:pPr>
       <w:r>
         <w:t>Sentence supported by selected evidence</w:t>
@@ -5997,6 +5762,9 @@
     <w:p>
       <w:pPr>
         <w:pStyle w:val="CodeBlock"/>
+        <w:rPr>
+          <w:rFonts w:hint="eastAsia"/>
+        </w:rPr>
       </w:pPr>
       <w:r>
         <w:t xml:space="preserve">                does not imply</w:t>
@@ -6005,6 +5773,9 @@
     <w:p>
       <w:pPr>
         <w:pStyle w:val="CodeBlock"/>
+        <w:rPr>
+          <w:rFonts w:hint="eastAsia"/>
+        </w:rPr>
       </w:pPr>
       <w:r>
         <w:t>Selected evidence belongs to the frozen target case</w:t>
@@ -6013,6 +5784,9 @@
     <w:p>
       <w:pPr>
         <w:pStyle w:val="CodeBlock"/>
+        <w:rPr>
+          <w:rFonts w:hint="eastAsia"/>
+        </w:rPr>
       </w:pPr>
       <w:r>
         <w:t xml:space="preserve">                does not imply</w:t>
@@ -6021,6 +5795,9 @@
     <w:p>
       <w:pPr>
         <w:pStyle w:val="CodeBlock"/>
+        <w:rPr>
+          <w:rFonts w:hint="eastAsia"/>
+        </w:rPr>
       </w:pPr>
       <w:r>
         <w:t>Answer is clinically correct or safe</w:t>
@@ -6048,7 +5825,7 @@
       <w:pPr>
         <w:pStyle w:val="21"/>
       </w:pPr>
-      <w:bookmarkStart w:id="4" w:name="_Toc238056243"/>
+      <w:bookmarkStart w:id="4" w:name="_Toc238056902"/>
       <w:r>
         <w:rPr>
           <w:rFonts w:ascii="Calibri" w:hAnsi="Calibri"/>
@@ -6066,7 +5843,7 @@
       <w:pPr>
         <w:pStyle w:val="21"/>
       </w:pPr>
-      <w:bookmarkStart w:id="5" w:name="_Toc238056244"/>
+      <w:bookmarkStart w:id="5" w:name="_Toc238056903"/>
       <w:r>
         <w:rPr>
           <w:rFonts w:ascii="Calibri" w:hAnsi="Calibri"/>
@@ -6149,7 +5926,7 @@
       <w:pPr>
         <w:pStyle w:val="21"/>
       </w:pPr>
-      <w:bookmarkStart w:id="6" w:name="_Toc238056245"/>
+      <w:bookmarkStart w:id="6" w:name="_Toc238056904"/>
       <w:r>
         <w:rPr>
           <w:rFonts w:ascii="Calibri" w:hAnsi="Calibri"/>
@@ -6206,7 +5983,7 @@
       <w:pPr>
         <w:pStyle w:val="21"/>
       </w:pPr>
-      <w:bookmarkStart w:id="7" w:name="_Toc238056246"/>
+      <w:bookmarkStart w:id="7" w:name="_Toc238056905"/>
       <w:r>
         <w:rPr>
           <w:rFonts w:ascii="Calibri" w:hAnsi="Calibri"/>
@@ -6254,7 +6031,7 @@
       <w:pPr>
         <w:pStyle w:val="21"/>
       </w:pPr>
-      <w:bookmarkStart w:id="8" w:name="_Toc238056247"/>
+      <w:bookmarkStart w:id="8" w:name="_Toc238056906"/>
       <w:r>
         <w:rPr>
           <w:rFonts w:ascii="Calibri" w:hAnsi="Calibri"/>
@@ -6283,7 +6060,7 @@
       <w:pPr>
         <w:pStyle w:val="21"/>
       </w:pPr>
-      <w:bookmarkStart w:id="9" w:name="_Toc238056248"/>
+      <w:bookmarkStart w:id="9" w:name="_Toc238056907"/>
       <w:r>
         <w:rPr>
           <w:rFonts w:ascii="Calibri" w:hAnsi="Calibri"/>
@@ -6302,7 +6079,7 @@
         <w:pStyle w:val="1"/>
         <w:pageBreakBefore/>
       </w:pPr>
-      <w:bookmarkStart w:id="10" w:name="_Toc238056249"/>
+      <w:bookmarkStart w:id="10" w:name="_Toc238056908"/>
       <w:r>
         <w:rPr>
           <w:rFonts w:ascii="Calibri" w:hAnsi="Calibri"/>
@@ -6316,7 +6093,7 @@
       <w:pPr>
         <w:pStyle w:val="21"/>
       </w:pPr>
-      <w:bookmarkStart w:id="11" w:name="_Toc238056250"/>
+      <w:bookmarkStart w:id="11" w:name="_Toc238056909"/>
       <w:r>
         <w:rPr>
           <w:rFonts w:ascii="Calibri" w:hAnsi="Calibri"/>
@@ -6339,7 +6116,7 @@
       <w:pPr>
         <w:pStyle w:val="21"/>
       </w:pPr>
-      <w:bookmarkStart w:id="12" w:name="_Toc238056251"/>
+      <w:bookmarkStart w:id="12" w:name="_Toc238056910"/>
       <w:r>
         <w:rPr>
           <w:rFonts w:ascii="Calibri" w:hAnsi="Calibri"/>
@@ -6362,7 +6139,7 @@
       <w:pPr>
         <w:pStyle w:val="21"/>
       </w:pPr>
-      <w:bookmarkStart w:id="13" w:name="_Toc238056252"/>
+      <w:bookmarkStart w:id="13" w:name="_Toc238056911"/>
       <w:r>
         <w:rPr>
           <w:rFonts w:ascii="Calibri" w:hAnsi="Calibri"/>
@@ -6391,7 +6168,7 @@
       <w:pPr>
         <w:pStyle w:val="21"/>
       </w:pPr>
-      <w:bookmarkStart w:id="14" w:name="_Toc238056253"/>
+      <w:bookmarkStart w:id="14" w:name="_Toc238056912"/>
       <w:r>
         <w:rPr>
           <w:rFonts w:ascii="Calibri" w:hAnsi="Calibri"/>
@@ -6414,7 +6191,7 @@
       <w:pPr>
         <w:pStyle w:val="21"/>
       </w:pPr>
-      <w:bookmarkStart w:id="15" w:name="_Toc238056254"/>
+      <w:bookmarkStart w:id="15" w:name="_Toc238056913"/>
       <w:r>
         <w:rPr>
           <w:rFonts w:ascii="Calibri" w:hAnsi="Calibri"/>
@@ -6442,7 +6219,7 @@
       <w:pPr>
         <w:pStyle w:val="21"/>
       </w:pPr>
-      <w:bookmarkStart w:id="16" w:name="_Toc238056255"/>
+      <w:bookmarkStart w:id="16" w:name="_Toc238056914"/>
       <w:r>
         <w:rPr>
           <w:rFonts w:ascii="Calibri" w:hAnsi="Calibri"/>
@@ -6474,7 +6251,7 @@
       <w:pPr>
         <w:pStyle w:val="21"/>
       </w:pPr>
-      <w:bookmarkStart w:id="17" w:name="_Toc238056256"/>
+      <w:bookmarkStart w:id="17" w:name="_Toc238056915"/>
       <w:r>
         <w:rPr>
           <w:rFonts w:ascii="Calibri" w:hAnsi="Calibri"/>
@@ -6542,7 +6319,7 @@
       <w:pPr>
         <w:pStyle w:val="21"/>
       </w:pPr>
-      <w:bookmarkStart w:id="18" w:name="_Toc238056257"/>
+      <w:bookmarkStart w:id="18" w:name="_Toc238056916"/>
       <w:r>
         <w:rPr>
           <w:rFonts w:ascii="Calibri" w:hAnsi="Calibri"/>
@@ -6571,7 +6348,7 @@
       <w:pPr>
         <w:pStyle w:val="21"/>
       </w:pPr>
-      <w:bookmarkStart w:id="19" w:name="_Toc238056258"/>
+      <w:bookmarkStart w:id="19" w:name="_Toc238056917"/>
       <w:r>
         <w:rPr>
           <w:rFonts w:ascii="Calibri" w:hAnsi="Calibri"/>
@@ -6594,7 +6371,7 @@
       <w:pPr>
         <w:pStyle w:val="21"/>
       </w:pPr>
-      <w:bookmarkStart w:id="20" w:name="_Toc238056259"/>
+      <w:bookmarkStart w:id="20" w:name="_Toc238056918"/>
       <w:r>
         <w:rPr>
           <w:rFonts w:ascii="Calibri" w:hAnsi="Calibri"/>
@@ -6623,7 +6400,7 @@
         <w:pStyle w:val="1"/>
         <w:pageBreakBefore/>
       </w:pPr>
-      <w:bookmarkStart w:id="21" w:name="_Toc238056260"/>
+      <w:bookmarkStart w:id="21" w:name="_Toc238056919"/>
       <w:r>
         <w:rPr>
           <w:rFonts w:ascii="Calibri" w:hAnsi="Calibri"/>
@@ -6637,7 +6414,7 @@
       <w:pPr>
         <w:pStyle w:val="21"/>
       </w:pPr>
-      <w:bookmarkStart w:id="22" w:name="_Toc238056261"/>
+      <w:bookmarkStart w:id="22" w:name="_Toc238056920"/>
       <w:r>
         <w:rPr>
           <w:rFonts w:ascii="Calibri" w:hAnsi="Calibri"/>
@@ -6648,7 +6425,10 @@
     </w:p>
     <w:p>
       <w:r>
-        <w:t>This study used a staged empirical system-comparison design to investigate retrieval-augmented medical question answering over paired radiology images and reports. Earlier text-only experiments identified two structural risks: open-corpus retrieval could select evidence from the wrong case, while a sentence-level verifier could still rate an answer as supported by that wrongly selected report. These findings motivated the final V5 experiment, which tested whether correctly paired chest X-ray information could improve target-report retrieval and whether any retrieval gain transferred to downstream report-grounded question answering.</w:t>
+        <w:t>This study used a staged empirical system-comparison design to investigate retrieval-augmented medical question answering over paired radiology images and reports. Earlier text-only experiments identified two structural risks: open-corpus retrieval could select evidence from the wrong case, while a sentence-level verifier could still rate an answer as supported by that wrongly selected report. These findings motivated the final V5 experiment, which tested whether correctly paired chest X-ray information cou</w:t>
+      </w:r>
+      <w:r>
+        <w:t>ld improve target-report retrieval and whether any retrieval gain transferred to downstream report-grounded question answering.</w:t>
       </w:r>
     </w:p>
     <w:p>
@@ -6702,7 +6482,7 @@
       <w:pPr>
         <w:pStyle w:val="21"/>
       </w:pPr>
-      <w:bookmarkStart w:id="23" w:name="_Toc238056262"/>
+      <w:bookmarkStart w:id="23" w:name="_Toc238056921"/>
       <w:r>
         <w:rPr>
           <w:rFonts w:ascii="Calibri" w:hAnsi="Calibri"/>
@@ -6734,7 +6514,7 @@
       <w:pPr>
         <w:pStyle w:val="21"/>
       </w:pPr>
-      <w:bookmarkStart w:id="24" w:name="_Toc238056263"/>
+      <w:bookmarkStart w:id="24" w:name="_Toc238056922"/>
       <w:r>
         <w:rPr>
           <w:rFonts w:ascii="Calibri" w:hAnsi="Calibri"/>
@@ -6823,7 +6603,7 @@
       <w:pPr>
         <w:pStyle w:val="21"/>
       </w:pPr>
-      <w:bookmarkStart w:id="25" w:name="_Toc238056264"/>
+      <w:bookmarkStart w:id="25" w:name="_Toc238056923"/>
       <w:r>
         <w:rPr>
           <w:rFonts w:ascii="Calibri" w:hAnsi="Calibri"/>
@@ -6916,7 +6696,7 @@
       <w:pPr>
         <w:pStyle w:val="21"/>
       </w:pPr>
-      <w:bookmarkStart w:id="26" w:name="_Toc238056265"/>
+      <w:bookmarkStart w:id="26" w:name="_Toc238056924"/>
       <w:r>
         <w:rPr>
           <w:rFonts w:ascii="Calibri" w:hAnsi="Calibri"/>
@@ -6939,7 +6719,7 @@
       <w:pPr>
         <w:pStyle w:val="21"/>
       </w:pPr>
-      <w:bookmarkStart w:id="27" w:name="_Toc238056266"/>
+      <w:bookmarkStart w:id="27" w:name="_Toc238056925"/>
       <w:r>
         <w:rPr>
           <w:rFonts w:ascii="Calibri" w:hAnsi="Calibri"/>
@@ -6984,7 +6764,7 @@
       <w:pPr>
         <w:pStyle w:val="21"/>
       </w:pPr>
-      <w:bookmarkStart w:id="28" w:name="_Toc238056267"/>
+      <w:bookmarkStart w:id="28" w:name="_Toc238056926"/>
       <w:r>
         <w:rPr>
           <w:rFonts w:ascii="Calibri" w:hAnsi="Calibri"/>
@@ -7044,7 +6824,7 @@
       <w:pPr>
         <w:pStyle w:val="21"/>
       </w:pPr>
-      <w:bookmarkStart w:id="29" w:name="_Toc238056268"/>
+      <w:bookmarkStart w:id="29" w:name="_Toc238056927"/>
       <w:r>
         <w:rPr>
           <w:rFonts w:ascii="Calibri" w:hAnsi="Calibri"/>
@@ -7094,7 +6874,7 @@
       <w:pPr>
         <w:pStyle w:val="21"/>
       </w:pPr>
-      <w:bookmarkStart w:id="30" w:name="_Toc238056269"/>
+      <w:bookmarkStart w:id="30" w:name="_Toc238056928"/>
       <w:r>
         <w:rPr>
           <w:rFonts w:ascii="Calibri" w:hAnsi="Calibri"/>
@@ -7122,7 +6902,7 @@
       <w:pPr>
         <w:pStyle w:val="21"/>
       </w:pPr>
-      <w:bookmarkStart w:id="31" w:name="_Toc238056270"/>
+      <w:bookmarkStart w:id="31" w:name="_Toc238056929"/>
       <w:r>
         <w:rPr>
           <w:rFonts w:ascii="Calibri" w:hAnsi="Calibri"/>
@@ -7144,7 +6924,10 @@
     </w:p>
     <w:p>
       <w:r>
-        <w:t>Protocol taxonomy v1.0 was preserved in the audit trail. During interpretation, a refined three-level taxonomy v1.1 separated pipeline stage, specific pattern, and outcome modifier. It distinguished target-rank movement from Top-1 success, generation omission from post-verification content loss, and abstention occurrence from its suspected cause. Assistant-proposed v1.1 labels were recorded separately from the original labels. The researcher reviewed and accepted all 24 proposals on 19 August 2026, producing 24 accepted, 0 modified, and 0 excluded cases.</w:t>
+        <w:t>Protocol taxonomy v1.0 was preserved in the audit trail. During interpretation, a refined three-level taxonomy v1.1 separated pipeline stage, specific pattern, and outcome modifier. It distinguished target-rank movement from Top-1 success, generation omission from post-verification content loss, and abstention occurrence from its suspected cause. Assistant-proposed v1.1 labels were recorded separately from the original labels. The researcher reviewed and accepted all 24 proposals on 19 August 2026, producin</w:t>
+      </w:r>
+      <w:r>
+        <w:t>g 24 accepted, 0 modified, and 0 excluded cases.</w:t>
       </w:r>
     </w:p>
     <w:p>
@@ -7156,7 +6939,7 @@
       <w:pPr>
         <w:pStyle w:val="21"/>
       </w:pPr>
-      <w:bookmarkStart w:id="32" w:name="_Toc238056271"/>
+      <w:bookmarkStart w:id="32" w:name="_Toc238056930"/>
       <w:r>
         <w:rPr>
           <w:rFonts w:ascii="Calibri" w:hAnsi="Calibri"/>
@@ -7179,7 +6962,7 @@
       <w:pPr>
         <w:pStyle w:val="21"/>
       </w:pPr>
-      <w:bookmarkStart w:id="33" w:name="_Toc238056272"/>
+      <w:bookmarkStart w:id="33" w:name="_Toc238056931"/>
       <w:r>
         <w:rPr>
           <w:rFonts w:ascii="Calibri" w:hAnsi="Calibri"/>
@@ -7198,7 +6981,7 @@
         <w:pStyle w:val="1"/>
         <w:pageBreakBefore/>
       </w:pPr>
-      <w:bookmarkStart w:id="34" w:name="_Toc238056273"/>
+      <w:bookmarkStart w:id="34" w:name="_Toc238056932"/>
       <w:r>
         <w:rPr>
           <w:rFonts w:ascii="Calibri" w:hAnsi="Calibri"/>
@@ -7212,7 +6995,7 @@
       <w:pPr>
         <w:pStyle w:val="21"/>
       </w:pPr>
-      <w:bookmarkStart w:id="35" w:name="_Toc238056274"/>
+      <w:bookmarkStart w:id="35" w:name="_Toc238056933"/>
       <w:r>
         <w:rPr>
           <w:rFonts w:ascii="Calibri" w:hAnsi="Calibri"/>
@@ -7222,11 +7005,16 @@
       <w:bookmarkEnd w:id="35"/>
     </w:p>
     <w:p>
+      <w:r>
+        <w:t>The four principal confirmation retrieval conditions are shown in Table 4.1.</w:t>
+      </w:r>
+    </w:p>
+    <w:p>
       <w:pPr>
         <w:pStyle w:val="af7"/>
       </w:pPr>
       <w:r>
-        <w:t>Table 4.1 shows the four principal confirmation retrieval conditions.</w:t>
+        <w:t>Table 4.1. Retrieval results under four principal input conditions</w:t>
       </w:r>
     </w:p>
     <w:tbl>
@@ -8010,7 +7798,7 @@
       <w:pPr>
         <w:pStyle w:val="21"/>
       </w:pPr>
-      <w:bookmarkStart w:id="36" w:name="_Toc238056275"/>
+      <w:bookmarkStart w:id="36" w:name="_Toc238056934"/>
       <w:r>
         <w:rPr>
           <w:rFonts w:ascii="Calibri" w:hAnsi="Calibri"/>
@@ -8031,19 +7819,22 @@
     </w:p>
     <w:p>
       <w:r>
-        <w:t>The Hit@1 increase was smaller: +0.0333, from 0.5889 to 0.6222. Its confidence interval reached approximately zero and the paired-randomization p-value was 0.0886. Thus, the strongest evidence concerns improved target ordering and retrieval within the upper ranks, not a definitive Hit@1 improvement.</w:t>
+        <w:t xml:space="preserve">The Hit@1 increase was smaller: +0.0333, from 0.5889 to 0.6222. Its confidence interval reached approximately zero and the paired-randomization p-value was 0.0886. Thus, the strongest evidence </w:t>
+      </w:r>
+      <w:r>
+        <w:lastRenderedPageBreak/>
+        <w:t>concerns improved target ordering and retrieval within the upper ranks, not a definitive Hit@1 improvement.</w:t>
       </w:r>
     </w:p>
     <w:p>
       <w:pPr>
         <w:pStyle w:val="21"/>
       </w:pPr>
-      <w:bookmarkStart w:id="37" w:name="_Toc238056276"/>
+      <w:bookmarkStart w:id="37" w:name="_Toc238056935"/>
       <w:r>
         <w:rPr>
           <w:rFonts w:ascii="Calibri" w:hAnsi="Calibri"/>
         </w:rPr>
-        <w:lastRenderedPageBreak/>
         <w:t>4.3 Correctly Aligned Versus Shuffled Images</w:t>
       </w:r>
       <w:bookmarkEnd w:id="37"/>
@@ -8062,7 +7853,7 @@
       <w:pPr>
         <w:pStyle w:val="21"/>
       </w:pPr>
-      <w:bookmarkStart w:id="38" w:name="_Toc238056277"/>
+      <w:bookmarkStart w:id="38" w:name="_Toc238056936"/>
       <w:r>
         <w:rPr>
           <w:rFonts w:ascii="Calibri" w:hAnsi="Calibri"/>
@@ -8072,11 +7863,16 @@
       <w:bookmarkEnd w:id="38"/>
     </w:p>
     <w:p>
+      <w:r>
+        <w:t>The same generator and checker are compared after report-only and multimodal retrieval in Table 4.2.</w:t>
+      </w:r>
+    </w:p>
+    <w:p>
       <w:pPr>
         <w:pStyle w:val="af7"/>
       </w:pPr>
       <w:r>
-        <w:t>Table 4.2 compares the same generator and checker after report-only and multimodal retrieval.</w:t>
+        <w:t>Table 4.2. End-to-end QA comparison</w:t>
       </w:r>
     </w:p>
     <w:tbl>
@@ -8573,11 +8369,12 @@
       <w:pPr>
         <w:pStyle w:val="21"/>
       </w:pPr>
-      <w:bookmarkStart w:id="39" w:name="_Toc238056278"/>
+      <w:bookmarkStart w:id="39" w:name="_Toc238056937"/>
       <w:r>
         <w:rPr>
           <w:rFonts w:ascii="Calibri" w:hAnsi="Calibri"/>
         </w:rPr>
+        <w:lastRenderedPageBreak/>
         <w:t>4.5 Researcher-Reviewed Qualitative Findings</w:t>
       </w:r>
       <w:bookmarkEnd w:id="39"/>
@@ -8589,7 +8386,6 @@
     </w:p>
     <w:p>
       <w:r>
-        <w:lastRenderedPageBreak/>
         <w:t>The overlapping accepted labels included 14 Top-1 retrieval failures, 10 Top-1 retrieval successes, 11 target-rank improvements, 7 target-rank degradations, 10 post-verification content-loss cases, 9 possible verifier-over-rejection cases, and 6 QA-gain/support-loss cases. These values characterize the selected review package only.</w:t>
       </w:r>
     </w:p>
@@ -8677,7 +8473,7 @@
       <w:pPr>
         <w:pStyle w:val="21"/>
       </w:pPr>
-      <w:bookmarkStart w:id="40" w:name="_Toc238056279"/>
+      <w:bookmarkStart w:id="40" w:name="_Toc238056938"/>
       <w:r>
         <w:rPr>
           <w:rFonts w:ascii="Calibri" w:hAnsi="Calibri"/>
@@ -8685,6 +8481,14 @@
         <w:t>4.6 Computational Cost</w:t>
       </w:r>
       <w:bookmarkEnd w:id="40"/>
+    </w:p>
+    <w:p>
+      <w:pPr>
+        <w:pStyle w:val="af7"/>
+      </w:pPr>
+      <w:r>
+        <w:t>Table 4.3. Runtime and computational cost</w:t>
+      </w:r>
     </w:p>
     <w:tbl>
       <w:tblPr>
@@ -9030,6 +8834,7 @@
               <w:rPr>
                 <w:sz w:val="18"/>
               </w:rPr>
+              <w:lastRenderedPageBreak/>
               <w:t>Multimodal</w:t>
             </w:r>
           </w:p>
@@ -9163,11 +8968,7 @@
     </w:p>
     <w:p>
       <w:r>
-        <w:t xml:space="preserve">Both QA runs used the same Qwen model and generation settings. The multimodal prompt path took approximately 10.84 seconds longer in total and generated 0.55 fewer records per second, while peak allocated memory remained effectively unchanged. Earlier V4.2 measurements recorded approximately </w:t>
-      </w:r>
-      <w:r>
-        <w:lastRenderedPageBreak/>
-        <w:t>14.91 ms mean single-image encoding, 1.73 ms BM25 retrieval, 0.28 ms cached reranking, and a 16.93 ms warm paired-request estimate.</w:t>
+        <w:t>Both QA runs used the same Qwen model and generation settings. The multimodal prompt path took approximately 10.84 seconds longer in total and generated 0.55 fewer records per second, while peak allocated memory remained effectively unchanged. Earlier V4.2 measurements recorded approximately 14.91 ms mean single-image encoding, 1.73 ms BM25 retrieval, 0.28 ms cached reranking, and a 16.93 ms warm paired-request estimate.</w:t>
       </w:r>
     </w:p>
     <w:p>
@@ -9179,7 +8980,7 @@
       <w:pPr>
         <w:pStyle w:val="21"/>
       </w:pPr>
-      <w:bookmarkStart w:id="41" w:name="_Toc238056280"/>
+      <w:bookmarkStart w:id="41" w:name="_Toc238056939"/>
       <w:r>
         <w:rPr>
           <w:rFonts w:ascii="Calibri" w:hAnsi="Calibri"/>
@@ -9203,7 +9004,7 @@
         <w:pStyle w:val="1"/>
         <w:pageBreakBefore/>
       </w:pPr>
-      <w:bookmarkStart w:id="42" w:name="_Toc238056281"/>
+      <w:bookmarkStart w:id="42" w:name="_Toc238056940"/>
       <w:r>
         <w:rPr>
           <w:rFonts w:ascii="Calibri" w:hAnsi="Calibri"/>
@@ -9217,7 +9018,7 @@
       <w:pPr>
         <w:pStyle w:val="21"/>
       </w:pPr>
-      <w:bookmarkStart w:id="43" w:name="_Toc238056282"/>
+      <w:bookmarkStart w:id="43" w:name="_Toc238056941"/>
       <w:r>
         <w:rPr>
           <w:rFonts w:ascii="Calibri" w:hAnsi="Calibri"/>
@@ -9230,7 +9031,7 @@
       <w:pPr>
         <w:pStyle w:val="31"/>
       </w:pPr>
-      <w:bookmarkStart w:id="44" w:name="_Toc238056283"/>
+      <w:bookmarkStart w:id="44" w:name="_Toc238056942"/>
       <w:r>
         <w:rPr>
           <w:rFonts w:ascii="Calibri" w:hAnsi="Calibri"/>
@@ -9248,7 +9049,7 @@
       <w:pPr>
         <w:pStyle w:val="31"/>
       </w:pPr>
-      <w:bookmarkStart w:id="45" w:name="_Toc238056284"/>
+      <w:bookmarkStart w:id="45" w:name="_Toc238056943"/>
       <w:r>
         <w:rPr>
           <w:rFonts w:ascii="Calibri" w:hAnsi="Calibri"/>
@@ -9266,7 +9067,7 @@
       <w:pPr>
         <w:pStyle w:val="31"/>
       </w:pPr>
-      <w:bookmarkStart w:id="46" w:name="_Toc238056285"/>
+      <w:bookmarkStart w:id="46" w:name="_Toc238056944"/>
       <w:r>
         <w:rPr>
           <w:rFonts w:ascii="Calibri" w:hAnsi="Calibri"/>
@@ -9284,7 +9085,7 @@
       <w:pPr>
         <w:pStyle w:val="31"/>
       </w:pPr>
-      <w:bookmarkStart w:id="47" w:name="_Toc238056286"/>
+      <w:bookmarkStart w:id="47" w:name="_Toc238056945"/>
       <w:r>
         <w:rPr>
           <w:rFonts w:ascii="Calibri" w:hAnsi="Calibri"/>
@@ -9302,7 +9103,7 @@
       <w:pPr>
         <w:pStyle w:val="21"/>
       </w:pPr>
-      <w:bookmarkStart w:id="48" w:name="_Toc238056287"/>
+      <w:bookmarkStart w:id="48" w:name="_Toc238056946"/>
       <w:r>
         <w:rPr>
           <w:rFonts w:ascii="Calibri" w:hAnsi="Calibri"/>
@@ -9341,7 +9142,7 @@
       <w:pPr>
         <w:pStyle w:val="21"/>
       </w:pPr>
-      <w:bookmarkStart w:id="49" w:name="_Toc238056288"/>
+      <w:bookmarkStart w:id="49" w:name="_Toc238056947"/>
       <w:r>
         <w:rPr>
           <w:rFonts w:ascii="Calibri" w:hAnsi="Calibri"/>
@@ -9374,7 +9175,7 @@
       <w:pPr>
         <w:pStyle w:val="21"/>
       </w:pPr>
-      <w:bookmarkStart w:id="50" w:name="_Toc238056289"/>
+      <w:bookmarkStart w:id="50" w:name="_Toc238056948"/>
       <w:r>
         <w:rPr>
           <w:rFonts w:ascii="Calibri" w:hAnsi="Calibri"/>
@@ -9418,7 +9219,7 @@
       <w:pPr>
         <w:pStyle w:val="21"/>
       </w:pPr>
-      <w:bookmarkStart w:id="51" w:name="_Toc238056290"/>
+      <w:bookmarkStart w:id="51" w:name="_Toc238056949"/>
       <w:r>
         <w:rPr>
           <w:rFonts w:ascii="Calibri" w:hAnsi="Calibri"/>
@@ -9457,7 +9258,7 @@
       <w:pPr>
         <w:pStyle w:val="21"/>
       </w:pPr>
-      <w:bookmarkStart w:id="52" w:name="_Toc238056291"/>
+      <w:bookmarkStart w:id="52" w:name="_Toc238056950"/>
       <w:r>
         <w:rPr>
           <w:rFonts w:ascii="Calibri" w:hAnsi="Calibri"/>
@@ -9486,7 +9287,7 @@
         <w:pStyle w:val="1"/>
         <w:pageBreakBefore/>
       </w:pPr>
-      <w:bookmarkStart w:id="53" w:name="_Toc238056292"/>
+      <w:bookmarkStart w:id="53" w:name="_Toc238056951"/>
       <w:r>
         <w:rPr>
           <w:rFonts w:ascii="Calibri" w:hAnsi="Calibri"/>
@@ -9655,7 +9456,7 @@
         <w:pStyle w:val="1"/>
         <w:pageBreakBefore/>
       </w:pPr>
-      <w:bookmarkStart w:id="54" w:name="_Toc238056293"/>
+      <w:bookmarkStart w:id="54" w:name="_Toc238056952"/>
       <w:r>
         <w:rPr>
           <w:rFonts w:ascii="Calibri" w:hAnsi="Calibri"/>
@@ -9669,7 +9470,7 @@
       <w:pPr>
         <w:pStyle w:val="21"/>
       </w:pPr>
-      <w:bookmarkStart w:id="55" w:name="_Toc238056294"/>
+      <w:bookmarkStart w:id="55" w:name="_Toc238056953"/>
       <w:r>
         <w:rPr>
           <w:rFonts w:ascii="Calibri" w:hAnsi="Calibri"/>
@@ -9837,7 +9638,7 @@
       <w:pPr>
         <w:pStyle w:val="21"/>
       </w:pPr>
-      <w:bookmarkStart w:id="56" w:name="_Toc238056295"/>
+      <w:bookmarkStart w:id="56" w:name="_Toc238056954"/>
       <w:r>
         <w:rPr>
           <w:rFonts w:ascii="Calibri" w:hAnsi="Calibri"/>
@@ -9989,7 +9790,7 @@
       <w:pPr>
         <w:pStyle w:val="21"/>
       </w:pPr>
-      <w:bookmarkStart w:id="57" w:name="_Toc238056296"/>
+      <w:bookmarkStart w:id="57" w:name="_Toc238056955"/>
       <w:r>
         <w:rPr>
           <w:rFonts w:ascii="Calibri" w:hAnsi="Calibri"/>
@@ -10031,6 +9832,9 @@
     <w:p>
       <w:pPr>
         <w:pStyle w:val="CodeBlock"/>
+        <w:rPr>
+          <w:rFonts w:hint="eastAsia"/>
+        </w:rPr>
       </w:pPr>
       <w:r>
         <w:t>&amp; ".\.venv\Scripts\python.exe" scripts\build_multimodal_v5_cohort.py</w:t>
@@ -10039,6 +9843,9 @@
     <w:p>
       <w:pPr>
         <w:pStyle w:val="CodeBlock"/>
+        <w:rPr>
+          <w:rFonts w:hint="eastAsia"/>
+        </w:rPr>
       </w:pPr>
       <w:r>
         <w:t>&amp; ".\.venv\Scripts\python.exe" scripts\run_multimodal_v5_retrieval.py --split confirmation --device cuda</w:t>
@@ -10047,6 +9854,9 @@
     <w:p>
       <w:pPr>
         <w:pStyle w:val="CodeBlock"/>
+        <w:rPr>
+          <w:rFonts w:hint="eastAsia"/>
+        </w:rPr>
       </w:pPr>
       <w:r>
         <w:t>&amp; ".\.venv\Scripts\python.exe" scripts\build_multimodal_v5_prompt_packs.py --split confirmation</w:t>
@@ -10055,6 +9865,9 @@
     <w:p>
       <w:pPr>
         <w:pStyle w:val="CodeBlock"/>
+        <w:rPr>
+          <w:rFonts w:hint="eastAsia"/>
+        </w:rPr>
       </w:pPr>
       <w:r>
         <w:t>&amp; ".\.venv\Scripts\python.exe" scripts\analyze_multimodal_v5_statistics.py</w:t>
@@ -10063,6 +9876,9 @@
     <w:p>
       <w:pPr>
         <w:pStyle w:val="CodeBlock"/>
+        <w:rPr>
+          <w:rFonts w:hint="eastAsia"/>
+        </w:rPr>
       </w:pPr>
       <w:r>
         <w:lastRenderedPageBreak/>
@@ -10072,6 +9888,9 @@
     <w:p>
       <w:pPr>
         <w:pStyle w:val="CodeBlock"/>
+        <w:rPr>
+          <w:rFonts w:hint="eastAsia"/>
+        </w:rPr>
       </w:pPr>
       <w:r>
         <w:t>&amp; ".\.venv\Scripts\python.exe" scripts\build_v5_qualitative_review_materials.py</w:t>
@@ -10080,6 +9899,9 @@
     <w:p>
       <w:pPr>
         <w:pStyle w:val="CodeBlock"/>
+        <w:rPr>
+          <w:rFonts w:hint="eastAsia"/>
+        </w:rPr>
       </w:pPr>
       <w:r>
         <w:t>&amp; ".\.venv\Scripts\python.exe" -m pytest -q</w:t>
@@ -10105,7 +9927,7 @@
       <w:pPr>
         <w:pStyle w:val="21"/>
       </w:pPr>
-      <w:bookmarkStart w:id="58" w:name="_Toc238056297"/>
+      <w:bookmarkStart w:id="58" w:name="_Toc238056956"/>
       <w:r>
         <w:rPr>
           <w:rFonts w:ascii="Calibri" w:hAnsi="Calibri"/>
@@ -10128,7 +9950,7 @@
       <w:pPr>
         <w:pStyle w:val="21"/>
       </w:pPr>
-      <w:bookmarkStart w:id="59" w:name="_Toc238056298"/>
+      <w:bookmarkStart w:id="59" w:name="_Toc238056957"/>
       <w:r>
         <w:rPr>
           <w:rFonts w:ascii="Calibri" w:hAnsi="Calibri"/>
@@ -10429,31 +10251,31 @@
       </w:rPr>
     </w:lvl>
   </w:abstractNum>
-  <w:num w:numId="1" w16cid:durableId="49379144">
+  <w:num w:numId="1" w16cid:durableId="878589546">
     <w:abstractNumId w:val="8"/>
   </w:num>
-  <w:num w:numId="2" w16cid:durableId="373625777">
+  <w:num w:numId="2" w16cid:durableId="1886289834">
     <w:abstractNumId w:val="6"/>
   </w:num>
-  <w:num w:numId="3" w16cid:durableId="903680803">
+  <w:num w:numId="3" w16cid:durableId="631985839">
     <w:abstractNumId w:val="5"/>
   </w:num>
-  <w:num w:numId="4" w16cid:durableId="1513110495">
+  <w:num w:numId="4" w16cid:durableId="436098625">
     <w:abstractNumId w:val="4"/>
   </w:num>
-  <w:num w:numId="5" w16cid:durableId="934941692">
+  <w:num w:numId="5" w16cid:durableId="779908881">
     <w:abstractNumId w:val="7"/>
   </w:num>
-  <w:num w:numId="6" w16cid:durableId="299698113">
+  <w:num w:numId="6" w16cid:durableId="2061712558">
     <w:abstractNumId w:val="3"/>
   </w:num>
-  <w:num w:numId="7" w16cid:durableId="1819609221">
+  <w:num w:numId="7" w16cid:durableId="358707002">
     <w:abstractNumId w:val="2"/>
   </w:num>
-  <w:num w:numId="8" w16cid:durableId="370107039">
+  <w:num w:numId="8" w16cid:durableId="465392430">
     <w:abstractNumId w:val="1"/>
   </w:num>
-  <w:num w:numId="9" w16cid:durableId="49813159">
+  <w:num w:numId="9" w16cid:durableId="2074307641">
     <w:abstractNumId w:val="0"/>
   </w:num>
 </w:numbering>
@@ -21867,14 +21689,18 @@
       <w:sz w:val="18"/>
     </w:rPr>
   </w:style>
-  <w:style w:type="paragraph" w:styleId="TOC1">
-    <w:name w:val="toc 1"/>
-    <w:basedOn w:val="a1"/>
-    <w:next w:val="a1"/>
-    <w:autoRedefine/>
-    <w:uiPriority w:val="39"/>
-    <w:unhideWhenUsed/>
-    <w:rsid w:val="000A11EC"/>
+  <w:style w:type="paragraph" w:customStyle="1" w:styleId="TOCHeadingCustom">
+    <w:name w:val="TOC Heading Custom"/>
+    <w:pPr>
+      <w:keepNext/>
+      <w:spacing w:after="280"/>
+    </w:pPr>
+    <w:rPr>
+      <w:rFonts w:ascii="Calibri" w:hAnsi="Calibri"/>
+      <w:b/>
+      <w:color w:val="1F4D78"/>
+      <w:sz w:val="36"/>
+    </w:rPr>
   </w:style>
   <w:style w:type="paragraph" w:styleId="TOC2">
     <w:name w:val="toc 2"/>
@@ -21883,10 +21709,19 @@
     <w:autoRedefine/>
     <w:uiPriority w:val="39"/>
     <w:unhideWhenUsed/>
-    <w:rsid w:val="000A11EC"/>
+    <w:rsid w:val="00E8501B"/>
     <w:pPr>
       <w:ind w:leftChars="200" w:left="420"/>
     </w:pPr>
+  </w:style>
+  <w:style w:type="paragraph" w:styleId="TOC1">
+    <w:name w:val="toc 1"/>
+    <w:basedOn w:val="a1"/>
+    <w:next w:val="a1"/>
+    <w:autoRedefine/>
+    <w:uiPriority w:val="39"/>
+    <w:unhideWhenUsed/>
+    <w:rsid w:val="00E8501B"/>
   </w:style>
   <w:style w:type="paragraph" w:styleId="TOC3">
     <w:name w:val="toc 3"/>
@@ -21895,7 +21730,7 @@
     <w:autoRedefine/>
     <w:uiPriority w:val="39"/>
     <w:unhideWhenUsed/>
-    <w:rsid w:val="000A11EC"/>
+    <w:rsid w:val="00E8501B"/>
     <w:pPr>
       <w:ind w:leftChars="400" w:left="840"/>
     </w:pPr>
@@ -21905,23 +21740,10 @@
     <w:basedOn w:val="a2"/>
     <w:uiPriority w:val="99"/>
     <w:unhideWhenUsed/>
-    <w:rsid w:val="000A11EC"/>
+    <w:rsid w:val="00E8501B"/>
     <w:rPr>
       <w:color w:val="0000FF" w:themeColor="hyperlink"/>
       <w:u w:val="single"/>
-    </w:rPr>
-  </w:style>
-  <w:style w:type="paragraph" w:customStyle="1" w:styleId="TOCHeadingCustom">
-    <w:name w:val="TOC Heading Custom"/>
-    <w:pPr>
-      <w:keepNext/>
-      <w:spacing w:after="280"/>
-    </w:pPr>
-    <w:rPr>
-      <w:rFonts w:ascii="Calibri" w:hAnsi="Calibri"/>
-      <w:b/>
-      <w:color w:val="17365D"/>
-      <w:sz w:val="36"/>
     </w:rPr>
   </w:style>
 </w:styles>

</xml_diff>